<commit_message>
resume: publish AI full-stack variant with online page and PDF
</commit_message>
<xml_diff>
--- a/resume/resume-ai-fullstack.docx
+++ b/resume/resume-ai-fullstack.docx
@@ -374,32 +374,26 @@
           <w:b/>
         </w:rPr>
         <w:t>烟标质检助手 · HarmonyOS 端侧质检 App（课题组校企合作 · 已通过真机验收）</w:t>
+      </w:r>
+      <w:r>
         <w:tab/>
         <w:t>2026.06 — 至今</w:t>
       </w:r>
     </w:p>
     <w:p>
       <w:pPr>
-        <w:keepNext/>
-        <w:spacing w:before="120" w:after="40" w:line="276" w:lineRule="auto"/>
+        <w:spacing w:before="0" w:after="20" w:line="276" w:lineRule="auto"/>
       </w:pPr>
       <w:r>
-        <w:rPr>
-          <w:rFonts w:ascii="微软雅黑" w:hAnsi="微软雅黑" w:eastAsia="微软雅黑"/>
-          <w:b/>
-          <w:color w:val="19232D"/>
-          <w:sz w:val="22"/>
-        </w:rPr>
-        <w:t>概述：PC 端烟标缺陷检测算法整体迁入鸿蒙手机，形成「拍摄 → 检测 → 判定 → 留档」的端侧闭环，已通过真机一致性验收；本人负责端侧前端（ArkTS + ArkUI）、跨语言算法层（NAPI + C++）与数据持久化。</w:t>
+        <w:t>把 PC 端的烟标缺陷检测算法整体迁入 HarmonyOS 手机，形成「拍摄 → 检测 → 判定 → 留档」端侧闭环。没有服务端、不依赖网络，现场抽检即可出结论；已通过真机一致性验收，本人负责端侧架构、跨语言算法层与数据层。</w:t>
       </w:r>
     </w:p>
     <w:p>
       <w:pPr>
-        <w:keepNext/>
-        <w:spacing w:before="120" w:after="40" w:line="276" w:lineRule="auto"/>
+        <w:spacing w:before="0" w:after="20" w:line="276" w:lineRule="auto"/>
       </w:pPr>
       <w:r>
-        <w:t>技术栈：ArkTS / ArkUI、C++、NAPI、OpenCV、HarmonyOS 端侧数据库、TaskPool</w:t>
+        <w:t>技术栈：ArkTS / ArkUI、C++、NAPI、OpenCV、HarmonyOS 端侧数据库、TaskPool、HAP 签名打包</w:t>
       </w:r>
     </w:p>
     <w:p>
@@ -417,10 +411,10 @@
         <w:rPr>
           <w:b/>
         </w:rPr>
-        <w:t>端侧三层架构：</w:t>
+        <w:t>三层架构与边界：</w:t>
       </w:r>
       <w:r>
-        <w:t>ArkTS + ArkUI 负责交互与状态，NAPI 桥接 C++ 算法库，OpenCV 静态编译进包；拍照、检测、结果回显全在端侧完成，不依赖云端，现场无网也能用</w:t>
+        <w:t>ArkTS + ArkUI 管界面与状态、NAPI 桥接 C++ 算法库、算法层与桌面版同源。好处是算法只维护一份、端侧只补适配层；代价是多一层跨语言调用与内存管理成本</w:t>
       </w:r>
     </w:p>
     <w:p>
@@ -438,10 +432,94 @@
         <w:rPr>
           <w:b/>
         </w:rPr>
-        <w:t>数据与状态：</w:t>
+        <w:t>为什么不用云：</w:t>
       </w:r>
       <w:r>
-        <w:t>样本库、检测历史与登录态持久化到端侧数据库，支持按时间与结果回溯；TaskPool 异步执行推理，大图检测时界面不卡顿</w:t>
+        <w:t>现场无网、单张图涉密，端侧推理是硬约束。放弃“手机拍照上传云端”的省事方案，换来确定性时延与数据不出机，代价是算法与依赖必须压进包体</w:t>
+      </w:r>
+    </w:p>
+    <w:p>
+      <w:pPr>
+        <w:spacing w:before="0" w:after="40" w:line="276" w:lineRule="auto"/>
+        <w:ind w:left="320" w:hanging="320"/>
+      </w:pPr>
+      <w:r>
+        <w:t>•</w:t>
+      </w:r>
+      <w:r>
+        <w:tab/>
+      </w:r>
+      <w:r>
+        <w:rPr>
+          <w:b/>
+        </w:rPr>
+        <w:t>算法替换的依据：</w:t>
+      </w:r>
+      <w:r>
+        <w:t>原方案用相位相关做对齐，在光照变化与袋体形变下会失效，改用 ORB + RANSAC 单应性；验收不看单帧指标，看「缺陷级一致」——同批样张在手机与 PC 上结论必须相同，6/6 通过</w:t>
+      </w:r>
+    </w:p>
+    <w:p>
+      <w:pPr>
+        <w:spacing w:before="0" w:after="40" w:line="276" w:lineRule="auto"/>
+        <w:ind w:left="320" w:hanging="320"/>
+      </w:pPr>
+      <w:r>
+        <w:t>•</w:t>
+      </w:r>
+      <w:r>
+        <w:tab/>
+      </w:r>
+      <w:r>
+        <w:rPr>
+          <w:b/>
+        </w:rPr>
+        <w:t>端侧性能取舍：</w:t>
+      </w:r>
+      <w:r>
+        <w:t>受端侧算力限制单张需数秒到数十秒。做法是 TaskPool 把推理移出 UI 线程、OpenCV 静态编译进包避免动态库依赖，界面全程可交互，不出现转圈卡死</w:t>
+      </w:r>
+    </w:p>
+    <w:p>
+      <w:pPr>
+        <w:spacing w:before="0" w:after="40" w:line="276" w:lineRule="auto"/>
+        <w:ind w:left="320" w:hanging="320"/>
+      </w:pPr>
+      <w:r>
+        <w:t>•</w:t>
+      </w:r>
+      <w:r>
+        <w:tab/>
+      </w:r>
+      <w:r>
+        <w:rPr>
+          <w:b/>
+        </w:rPr>
+        <w:t>数据层：</w:t>
+      </w:r>
+      <w:r>
+        <w:t>样本库、检测历史与登录态持久化到端侧数据库，支持按时间与结果回溯；检测记录与原始图绑定，便于现场复现同一张烟标的判定过程</w:t>
+      </w:r>
+    </w:p>
+    <w:p>
+      <w:pPr>
+        <w:spacing w:before="0" w:after="40" w:line="276" w:lineRule="auto"/>
+        <w:ind w:left="320" w:hanging="320"/>
+      </w:pPr>
+      <w:r>
+        <w:t>•</w:t>
+      </w:r>
+      <w:r>
+        <w:tab/>
+      </w:r>
+      <w:r>
+        <w:rPr>
+          <w:b/>
+        </w:rPr>
+        <w:t>交付与验证：</w:t>
+      </w:r>
+      <w:r>
+        <w:t>按「测试集回归 → NAPI 链路打通 → C++ 全量移植 → 真机一致性验收」四阶段推进，每阶段有明确出口条件；覆盖文字行、图标、烫金套印与脏点四类缺陷</w:t>
       </w:r>
     </w:p>
     <w:p>
@@ -581,52 +659,10 @@
         <w:rPr>
           <w:b/>
         </w:rPr>
-        <w:t>可见光算法链路：</w:t>
+        <w:t>双路算法与融合：</w:t>
       </w:r>
       <w:r>
-        <w:t>5 项加权边缘得分图 → 动态规划跟踪（相邻列 max_step 3px、跳变惩罚）求最优连续边缘 → 确定性 RANSAC 拟合基准线，内点率 / 覆盖率 / 残差 / 倾角四重质量门；双通道亮色候选 + 相对袋体底色验证 + 镜面高光抑制压假阳性</w:t>
-      </w:r>
-    </w:p>
-    <w:p>
-      <w:pPr>
-        <w:spacing w:before="0" w:after="40" w:line="276" w:lineRule="auto"/>
-        <w:ind w:left="320" w:hanging="320"/>
-      </w:pPr>
-      <w:r>
-        <w:t>•</w:t>
-      </w:r>
-      <w:r>
-        <w:tab/>
-      </w:r>
-      <w:r>
-        <w:rPr>
-          <w:b/>
-        </w:rPr>
-        <w:t>红外算法链路：</w:t>
-      </w:r>
-      <w:r>
-        <w:t>自适应温度分割（P20 + 0.45×(P90−P20)，与绝对温度下限取大）→ 连通域打分与粘连精化 → 逐列量测宽 / 高 / 面积 / 倾斜；局部形变用短窗−长窗中值残差 + 播种扩张，异物用局部温度参考 + 3.5×σ_MAD（cap 20 ℃）</w:t>
-      </w:r>
-    </w:p>
-    <w:p>
-      <w:pPr>
-        <w:spacing w:before="0" w:after="40" w:line="276" w:lineRule="auto"/>
-        <w:ind w:left="320" w:hanging="320"/>
-      </w:pPr>
-      <w:r>
-        <w:t>•</w:t>
-      </w:r>
-      <w:r>
-        <w:tab/>
-      </w:r>
-      <w:r>
-        <w:rPr>
-          <w:b/>
-        </w:rPr>
-        <w:t>融合与可靠性：</w:t>
-      </w:r>
-      <w:r>
-        <w:t>双相机 PLC 硬触发同帧、纳秒戳配对（±100 ms），任一路缺失 / 损坏即降级 UNKNOWN 而非放行；判定阈值全配置化热更新，配置 SHA256 指纹 + 离线批量回归保证「同图同结论」</w:t>
+        <w:t>可见光侧 DP 跟踪求最优边缘 + 确定性 RANSAC 拟合基准线（内点率 / 覆盖率 / 残差 / 倾角四重质量门）；红外侧自适应温度分割、逐列几何量测、MAD 稳健异物检测；双相机 PLC 硬触发同帧、纳秒戳配对 ±100 ms，任一路缺失即降级 UNKNOWN 而非放行</w:t>
       </w:r>
     </w:p>
     <w:p>

</xml_diff>

<commit_message>
resume: AI full-stack variant updated with YOLOv8 and server upload
</commit_message>
<xml_diff>
--- a/resume/resume-ai-fullstack.docx
+++ b/resume/resume-ai-fullstack.docx
@@ -55,16 +55,7 @@
           <w:color w:val="5A6470"/>
           <w:sz w:val="20"/>
         </w:rPr>
-        <w:t>联系方式：15319902705（同微信） · 2753538923@qq.com · GitHub: Tang-0118</w:t>
-      </w:r>
-      <w:r>
-        <w:rPr>
-          <w:rFonts w:ascii="微软雅黑" w:hAnsi="微软雅黑" w:eastAsia="微软雅黑"/>
-          <w:b w:val="0"/>
-          <w:color w:val="5A6470"/>
-          <w:sz w:val="20"/>
-        </w:rPr>
-        <w:t xml:space="preserve"> · 主页：kexin.uno</w:t>
+        <w:t>联系方式：15319902705（同微信） · 2753538923@qq.com · GitHub: Tang-0118 · 主页：kexin.uno</w:t>
       </w:r>
     </w:p>
     <w:p>
@@ -126,13 +117,18 @@
           <w:color w:val="19232D"/>
           <w:sz w:val="20"/>
         </w:rPr>
-        <w:t>计算机学院 · 智能科学与技术（本科在读）</w:t>
+        <w:t>计算机学院 · 智能科学与技术（</w:t>
       </w:r>
-    </w:p>
-    <w:p>
-      <w:pPr>
-        <w:spacing w:before="0" w:after="40" w:line="276" w:lineRule="auto"/>
-      </w:pPr>
+      <w:r>
+        <w:rPr>
+          <w:rFonts w:hint="eastAsia" w:ascii="微软雅黑" w:hAnsi="微软雅黑" w:eastAsia="微软雅黑"/>
+          <w:b w:val="0"/>
+          <w:color w:val="19232D"/>
+          <w:sz w:val="20"/>
+          <w:lang w:val="en-US" w:eastAsia="zh-CN"/>
+        </w:rPr>
+        <w:t>大三</w:t>
+      </w:r>
       <w:r>
         <w:rPr>
           <w:rFonts w:ascii="微软雅黑" w:hAnsi="微软雅黑" w:eastAsia="微软雅黑"/>
@@ -140,7 +136,7 @@
           <w:color w:val="19232D"/>
           <w:sz w:val="20"/>
         </w:rPr>
-        <w:t>GPA：3.46 / 4.0（86.61 / 100）</w:t>
+        <w:t>在读）</w:t>
       </w:r>
     </w:p>
     <w:p>
@@ -296,11 +292,50 @@
       <w:r>
         <w:rPr>
           <w:rFonts w:ascii="微软雅黑" w:hAnsi="微软雅黑" w:eastAsia="微软雅黑"/>
+          <w:b/>
+          <w:bCs/>
+          <w:color w:val="19232D"/>
+          <w:sz w:val="20"/>
+        </w:rPr>
+        <w:t>论文 PD-CAT 2026 国际会议</w:t>
+      </w:r>
+      <w:r>
+        <w:rPr>
+          <w:rFonts w:ascii="微软雅黑" w:hAnsi="微软雅黑" w:eastAsia="微软雅黑"/>
           <w:b w:val="0"/>
           <w:color w:val="19232D"/>
           <w:sz w:val="20"/>
         </w:rPr>
-        <w:t xml:space="preserve">论文 PD-CAT 2026 国际会议 </w:t>
+        <w:t xml:space="preserve"> 在审（并行三维网格生成）</w:t>
+      </w:r>
+    </w:p>
+    <w:p>
+      <w:pPr>
+        <w:spacing w:before="0" w:after="20" w:line="276" w:lineRule="auto"/>
+        <w:rPr>
+          <w:rFonts w:ascii="微软雅黑" w:hAnsi="微软雅黑" w:eastAsia="微软雅黑"/>
+          <w:b w:val="0"/>
+          <w:color w:val="19232D"/>
+          <w:sz w:val="20"/>
+        </w:rPr>
+      </w:pPr>
+      <w:r>
+        <w:rPr>
+          <w:rFonts w:ascii="微软雅黑" w:hAnsi="微软雅黑" w:eastAsia="微软雅黑"/>
+          <w:b/>
+          <w:color w:val="19232D"/>
+          <w:sz w:val="20"/>
+        </w:rPr>
+        <w:t>软件著作权 登记</w:t>
+      </w:r>
+      <w:r>
+        <w:rPr>
+          <w:rFonts w:ascii="微软雅黑" w:hAnsi="微软雅黑" w:eastAsia="微软雅黑"/>
+          <w:b w:val="0"/>
+          <w:color w:val="19232D"/>
+          <w:sz w:val="20"/>
+        </w:rPr>
+        <w:t>已受理</w:t>
       </w:r>
       <w:r>
         <w:rPr>
@@ -309,7 +344,7 @@
           <w:color w:val="19232D"/>
           <w:sz w:val="20"/>
         </w:rPr>
-        <w:t>在审</w:t>
+        <w:t xml:space="preserve"> · 专利</w:t>
       </w:r>
       <w:r>
         <w:rPr>
@@ -318,21 +353,7 @@
           <w:color w:val="19232D"/>
           <w:sz w:val="20"/>
         </w:rPr>
-        <w:t>（并行三维网格生成）</w:t>
-      </w:r>
-    </w:p>
-    <w:p>
-      <w:pPr>
-        <w:spacing w:before="0" w:after="20" w:line="276" w:lineRule="auto"/>
-      </w:pPr>
-      <w:r>
-        <w:rPr>
-          <w:rFonts w:ascii="微软雅黑" w:hAnsi="微软雅黑" w:eastAsia="微软雅黑"/>
-          <w:b/>
-          <w:color w:val="19232D"/>
-          <w:sz w:val="20"/>
-        </w:rPr>
-        <w:t>软件著作权 登记已受理 · 专利在审（均基于烟标质检助手）</w:t>
+        <w:t>在审（基于烟标质检助手）</w:t>
       </w:r>
     </w:p>
     <w:p>
@@ -377,150 +398,175 @@
       </w:r>
       <w:r>
         <w:tab/>
+      </w:r>
+      <w:r>
         <w:t>2026.06 — 至今</w:t>
       </w:r>
     </w:p>
     <w:p>
       <w:pPr>
-        <w:spacing w:before="0" w:after="20" w:line="276" w:lineRule="auto"/>
+        <w:pStyle w:val="30"/>
+        <w:keepNext w:val="0"/>
+        <w:keepLines w:val="0"/>
+        <w:widowControl/>
+        <w:suppressLineNumbers w:val="0"/>
+        <w:shd w:val="clear" w:fill="FFFFFF"/>
+        <w:spacing w:before="160" w:beforeAutospacing="0" w:after="160" w:afterAutospacing="0"/>
+        <w:ind w:left="0" w:right="0" w:firstLine="0"/>
+        <w:rPr>
+          <w:rFonts w:ascii="Segoe UI" w:hAnsi="Segoe UI" w:eastAsia="Segoe UI" w:cs="Segoe UI"/>
+          <w:i w:val="0"/>
+          <w:iCs w:val="0"/>
+          <w:caps w:val="0"/>
+          <w:color w:val="0F1115"/>
+          <w:spacing w:val="0"/>
+          <w:sz w:val="21"/>
+          <w:szCs w:val="21"/>
+        </w:rPr>
       </w:pPr>
       <w:r>
-        <w:t>把 PC 端的烟标缺陷检测算法整体迁入 HarmonyOS 手机，形成「拍摄 → 检测 → 判定 → 留档」端侧闭环。没有服务端、不依赖网络，现场抽检即可出结论；已通过真机一致性验收，本人负责端侧架构、跨语言算法层与数据层。</w:t>
+        <w:rPr>
+          <w:rFonts w:hint="default" w:ascii="Segoe UI" w:hAnsi="Segoe UI" w:eastAsia="Segoe UI" w:cs="Segoe UI"/>
+          <w:i w:val="0"/>
+          <w:iCs w:val="0"/>
+          <w:caps w:val="0"/>
+          <w:color w:val="0F1115"/>
+          <w:spacing w:val="0"/>
+          <w:sz w:val="21"/>
+          <w:szCs w:val="21"/>
+          <w:shd w:val="clear" w:fill="FFFFFF"/>
+        </w:rPr>
+        <w:t>把 烟标缺陷检测搬到 HarmonyOS 手机：YOLOv8 在端侧推理出结论，检测记录与原图上传服务器做集中复核与统计，形成「拍摄 → 检测 → 判定 → 上传 → 复核」闭环。本人负责端侧架构、模型接入、可靠上传与本地数据层。</w:t>
       </w:r>
     </w:p>
     <w:p>
       <w:pPr>
-        <w:spacing w:before="0" w:after="20" w:line="276" w:lineRule="auto"/>
+        <w:pStyle w:val="30"/>
+        <w:keepNext w:val="0"/>
+        <w:keepLines w:val="0"/>
+        <w:widowControl/>
+        <w:suppressLineNumbers w:val="0"/>
+        <w:shd w:val="clear" w:fill="FFFFFF"/>
+        <w:spacing w:before="160" w:beforeAutospacing="0" w:after="160" w:afterAutospacing="0"/>
+        <w:ind w:left="0" w:right="0" w:firstLine="0"/>
+        <w:rPr>
+          <w:rFonts w:hint="default" w:ascii="Segoe UI" w:hAnsi="Segoe UI" w:eastAsia="Segoe UI" w:cs="Segoe UI"/>
+          <w:i w:val="0"/>
+          <w:iCs w:val="0"/>
+          <w:caps w:val="0"/>
+          <w:color w:val="0F1115"/>
+          <w:spacing w:val="0"/>
+          <w:sz w:val="21"/>
+          <w:szCs w:val="21"/>
+        </w:rPr>
       </w:pPr>
       <w:r>
-        <w:t>技术栈：ArkTS / ArkUI、C++、NAPI、OpenCV、HarmonyOS 端侧数据库、TaskPool、HAP 签名打包</w:t>
+        <w:rPr>
+          <w:rFonts w:hint="default" w:ascii="Segoe UI" w:hAnsi="Segoe UI" w:eastAsia="Segoe UI" w:cs="Segoe UI"/>
+          <w:i w:val="0"/>
+          <w:iCs w:val="0"/>
+          <w:caps w:val="0"/>
+          <w:color w:val="0F1115"/>
+          <w:spacing w:val="0"/>
+          <w:sz w:val="21"/>
+          <w:szCs w:val="21"/>
+          <w:shd w:val="clear" w:fill="FFFFFF"/>
+        </w:rPr>
+        <w:t>技术栈：ArkTS / ArkUI、YOLOv8、模型导出与端侧推理、C++ / NAPI、OpenCV、HarmonyOS RDB、HTTP 上传与重试、TaskPool、HAP 签名打包</w:t>
       </w:r>
     </w:p>
     <w:p>
       <w:pPr>
         <w:spacing w:before="0" w:after="40" w:line="276" w:lineRule="auto"/>
         <w:ind w:left="320" w:hanging="320"/>
+        <w:rPr>
+          <w:rFonts w:hint="default"/>
+        </w:rPr>
       </w:pPr>
       <w:r>
-        <w:t>•</w:t>
-      </w:r>
-      <w:r>
-        <w:tab/>
-      </w:r>
-      <w:r>
         <w:rPr>
-          <w:b/>
+          <w:rFonts w:hint="default"/>
         </w:rPr>
-        <w:t>三层架构与边界：</w:t>
-      </w:r>
-      <w:r>
-        <w:t>ArkTS + ArkUI 管界面与状态、NAPI 桥接 C++ 算法库、算法层与桌面版同源。好处是算法只维护一份、端侧只补适配层；代价是多一层跨语言调用与内存管理成本</w:t>
+        <w:t>• 端侧 AI 链路：拍摄取图 → 预处理 → YOLOv8 推理 → 置信度过滤 → 本地落库 → 上传。模型与业务解耦，检测器可整体替换（早期传统 CV 链路切到 YOLOv8），换模型不动界面、数据与上传逻辑</w:t>
       </w:r>
     </w:p>
     <w:p>
       <w:pPr>
         <w:spacing w:before="0" w:after="40" w:line="276" w:lineRule="auto"/>
         <w:ind w:left="320" w:hanging="320"/>
+        <w:rPr>
+          <w:rFonts w:hint="default"/>
+        </w:rPr>
       </w:pPr>
       <w:r>
-        <w:t>•</w:t>
-      </w:r>
-      <w:r>
-        <w:tab/>
-      </w:r>
-      <w:r>
         <w:rPr>
-          <w:b/>
+          <w:rFonts w:hint="default"/>
         </w:rPr>
-        <w:t>为什么不用云：</w:t>
-      </w:r>
-      <w:r>
-        <w:t>现场无网、单张图涉密，端侧推理是硬约束。放弃“手机拍照上传云端”的省事方案，换来确定性时延与数据不出机，代价是算法与依赖必须压进包体</w:t>
+        <w:t>• 上传可靠性：检测记录带唯一 ID 与状态机（待上传 / 已上传 / 失败），失败按退避重试、重复上传按 ID 幂等去重；原图与记录分开传，先小后大，弱网下优先保住判定结论</w:t>
       </w:r>
     </w:p>
     <w:p>
       <w:pPr>
         <w:spacing w:before="0" w:after="40" w:line="276" w:lineRule="auto"/>
         <w:ind w:left="320" w:hanging="320"/>
+        <w:rPr>
+          <w:rFonts w:hint="eastAsia" w:eastAsia="宋体"/>
+          <w:lang w:eastAsia="zh-CN"/>
+        </w:rPr>
       </w:pPr>
       <w:r>
-        <w:t>•</w:t>
-      </w:r>
-      <w:r>
-        <w:tab/>
+        <w:rPr>
+          <w:rFonts w:hint="default"/>
+        </w:rPr>
+        <w:t>• </w:t>
       </w:r>
       <w:r>
         <w:rPr>
-          <w:b/>
+          <w:rFonts w:hint="eastAsia"/>
+          <w:lang w:eastAsia="zh-CN"/>
         </w:rPr>
-        <w:t>算法替换的依据：</w:t>
-      </w:r>
-      <w:r>
-        <w:t>原方案用相位相关做对齐，在光照变化与袋体形变下会失效，改用 ORB + RANSAC 单应性；验收不看单帧指标，看「缺陷级一致」——同批样张在手机与 PC 上结论必须相同，6/6 通过</w:t>
+        <w:t>模型置信度分流策略：高置信度结果直接输出判定结论，低置信度结果标记“建议人工复核”，复核结果回流样本库，用于补充训练数据与下一轮模型迭代。</w:t>
       </w:r>
     </w:p>
     <w:p>
       <w:pPr>
         <w:spacing w:before="0" w:after="40" w:line="276" w:lineRule="auto"/>
         <w:ind w:left="320" w:hanging="320"/>
+        <w:rPr>
+          <w:rFonts w:hint="default"/>
+        </w:rPr>
       </w:pPr>
       <w:r>
-        <w:t>•</w:t>
-      </w:r>
-      <w:r>
-        <w:tab/>
-      </w:r>
-      <w:r>
         <w:rPr>
-          <w:b/>
+          <w:rFonts w:hint="default"/>
         </w:rPr>
-        <w:t>端侧性能取舍：</w:t>
-      </w:r>
-      <w:r>
-        <w:t>受端侧算力限制单张需数秒到数十秒。做法是 TaskPool 把推理移出 UI 线程、OpenCV 静态编译进包避免动态库依赖，界面全程可交互，不出现转圈卡死</w:t>
+        <w:t>• 数据层（RDB）：样本库、检测历史、上传状态与登录态持久化到 HarmonyOS 关系型数据库，支持按时间 / 结果 / 置信度 / 上传状态检索；原图与记录绑定，可复现任意一张烟标的判定过程</w:t>
       </w:r>
     </w:p>
     <w:p>
       <w:pPr>
         <w:spacing w:before="0" w:after="40" w:line="276" w:lineRule="auto"/>
         <w:ind w:left="320" w:hanging="320"/>
+        <w:rPr>
+          <w:rFonts w:hint="eastAsia" w:eastAsia="宋体"/>
+          <w:lang w:eastAsia="zh-CN"/>
+        </w:rPr>
       </w:pPr>
       <w:r>
-        <w:t>•</w:t>
-      </w:r>
-      <w:r>
-        <w:tab/>
+        <w:rPr>
+          <w:rFonts w:hint="default"/>
+        </w:rPr>
+        <w:t>• 交付与验证：按「数据与标注 → 模型训练导出 → NAPI 打通 → 真机一致性验收」四阶段推进；覆盖文字行、图标、烫金套印与脏点四类缺陷</w:t>
       </w:r>
       <w:r>
         <w:rPr>
-          <w:b/>
+          <w:rFonts w:hint="eastAsia" w:eastAsia="宋体"/>
+          <w:lang w:eastAsia="zh-CN"/>
         </w:rPr>
-        <w:t>数据层：</w:t>
+        <w:t>。</w:t>
       </w:r>
-      <w:r>
-        <w:t>样本库、检测历史与登录态持久化到端侧数据库，支持按时间与结果回溯；检测记录与原始图绑定，便于现场复现同一张烟标的判定过程</w:t>
-      </w:r>
-    </w:p>
-    <w:p>
-      <w:pPr>
-        <w:spacing w:before="0" w:after="40" w:line="276" w:lineRule="auto"/>
-        <w:ind w:left="320" w:hanging="320"/>
-      </w:pPr>
-      <w:r>
-        <w:t>•</w:t>
-      </w:r>
-      <w:r>
-        <w:tab/>
-      </w:r>
-      <w:r>
-        <w:rPr>
-          <w:b/>
-        </w:rPr>
-        <w:t>交付与验证：</w:t>
-      </w:r>
-      <w:r>
-        <w:t>按「测试集回归 → NAPI 链路打通 → C++ 全量移植 → 真机一致性验收」四阶段推进，每阶段有明确出口条件；覆盖文字行、图标、烫金套印与脏点四类缺陷</w:t>
-      </w:r>
+      <w:bookmarkStart w:id="0" w:name="_GoBack"/>
+      <w:bookmarkEnd w:id="0"/>
     </w:p>
     <w:p>
       <w:pPr>
@@ -615,54 +661,68 @@
       <w:pPr>
         <w:spacing w:before="0" w:after="40" w:line="276" w:lineRule="auto"/>
         <w:ind w:left="320" w:hanging="320"/>
+        <w:rPr>
+          <w:rFonts w:hint="eastAsia"/>
+          <w:lang w:eastAsia="zh-CN"/>
+        </w:rPr>
       </w:pPr>
       <w:r>
-        <w:t>•</w:t>
-        <w:tab/>
-        <w:t>AI 层（Agent + RAG）：在不动原有相机 / 算法 / PLC 的前提下加独立 AI 应用层：自研编排（意图识别、工具选择、会话记忆、十六个工具），FastAPI + SSE 流式输出；混合检索 BM25 0.6 + 向量 0.4 后重排取前 5，答案带引用，证据不足明确拒答（9/9）</w:t>
+        <w:rPr>
+          <w:rFonts w:hint="eastAsia"/>
+          <w:lang w:eastAsia="zh-CN"/>
+        </w:rPr>
+        <w:t>•AI层（Agent + RAG）：在不改动原有相机、算法、PLC的前提下叠加独立AI应用层，自研编排模块（含意图识别、工具选择、会话记忆、16个工具），基于FastAPI与SSE实现流式输出；采用BM25权重0.6、向量检索权重0.4的混合检索方案，检索后重排取前5条结果，答案附引用来源，证据不足时明确拒答（9/9）。</w:t>
       </w:r>
     </w:p>
     <w:p>
       <w:pPr>
         <w:spacing w:before="0" w:after="40" w:line="276" w:lineRule="auto"/>
         <w:ind w:left="320" w:hanging="320"/>
+        <w:rPr>
+          <w:rFonts w:hint="eastAsia"/>
+          <w:lang w:eastAsia="zh-CN"/>
+        </w:rPr>
       </w:pPr>
       <w:r>
-        <w:t>•</w:t>
-        <w:tab/>
-        <w:t>评测与反馈：132 条工具回归（覆盖全部 16 个工具，断言工具链与包号解析）+ 105 条语义评测 + 288 例视觉标注（褶皱与工艺参数越界 0 例）；差评只问操作员「哪不对」，导出后带问答原文补成评测用例</w:t>
+        <w:rPr>
+          <w:rFonts w:hint="eastAsia"/>
+          <w:lang w:eastAsia="zh-CN"/>
+        </w:rPr>
+        <w:t>•评测与反馈：设置132条工具回归用例（覆盖全部16个工具，校验工具链与包号解析逻辑）、105条语义评测用例、288例视觉标注（褶皱与工艺参数越界标注为0例）；针对差评仅询问操作员“问题出在哪”，导出后结合问答原文补充为新的评测用例。</w:t>
       </w:r>
     </w:p>
     <w:p>
       <w:pPr>
         <w:spacing w:before="0" w:after="40" w:line="276" w:lineRule="auto"/>
         <w:ind w:left="320" w:hanging="320"/>
+        <w:rPr>
+          <w:rFonts w:hint="eastAsia"/>
+          <w:lang w:eastAsia="zh-CN"/>
+        </w:rPr>
       </w:pPr>
       <w:r>
-        <w:t>•</w:t>
-        <w:tab/>
-        <w:t>全栈交付：FastAPI + Postgres + React 工作台，Docker Compose 一条命令起 nginx → api → pg，SSE 关缓冲逐字输出；重排熔断、向量超时退回关键词、模型可切本地 4B 与云端，端到端 19.5 s → 3–5 s</w:t>
+        <w:rPr>
+          <w:rFonts w:hint="eastAsia"/>
+          <w:lang w:eastAsia="zh-CN"/>
+        </w:rPr>
+        <w:t>•全栈交付：采用FastAPI + Postgres + React工作台架构，通过Docker Compose一键启动nginx、api、pg服务，关闭SSE缓冲实现逐字输出；内置重排熔断、向量超时自动退回关键词检索、本地4B模型与云端模型可切换能力，端到端响应耗时从19.5s降至3-5s。</w:t>
       </w:r>
     </w:p>
     <w:p>
       <w:pPr>
         <w:spacing w:before="0" w:after="40" w:line="276" w:lineRule="auto"/>
         <w:ind w:left="320" w:hanging="320"/>
+        <w:rPr>
+          <w:rFonts w:hint="eastAsia"/>
+          <w:lang w:eastAsia="zh-CN"/>
+        </w:rPr>
       </w:pPr>
       <w:r>
-        <w:t>•</w:t>
-      </w:r>
-      <w:r>
-        <w:tab/>
-      </w:r>
-      <w:r>
         <w:rPr>
-          <w:b/>
+          <w:rFonts w:hint="eastAsia"/>
+          <w:lang w:eastAsia="zh-CN"/>
         </w:rPr>
-        <w:t>双路算法与融合：</w:t>
-      </w:r>
-      <w:r>
-        <w:t>可见光侧 DP 跟踪求最优边缘 + 确定性 RANSAC 拟合基准线（内点率 / 覆盖率 / 残差 / 倾角四重质量门）；红外侧自适应温度分割、逐列几何量测、MAD 稳健异物检测；双相机 PLC 硬触发同帧、纳秒戳配对 ±100 ms，任一路缺失即降级 UNKNOWN 而非放行</w:t>
+        <w:t>•双路算法与融合：可见光侧采用DP跟踪求解最优边缘，结合确定性RANSAC拟合基准线（设置内点率、覆盖率、残差、倾角四重质量门）；红外侧实现自适应温度分割、逐列几何量测、基于MAD的稳健异物检测；双相机通过PLC硬触发同帧采集，纳秒级时间戳配对误差±100ms，任一路数据缺失即降级为UNKNOWN状态，而非直接放行。</w:t>
       </w:r>
     </w:p>
     <w:p>
@@ -744,6 +804,10 @@
       <w:pPr>
         <w:spacing w:before="0" w:after="40" w:line="276" w:lineRule="auto"/>
         <w:ind w:left="320" w:hanging="320"/>
+        <w:rPr>
+          <w:rFonts w:hint="eastAsia" w:eastAsia="宋体"/>
+          <w:lang w:eastAsia="zh-CN"/>
+        </w:rPr>
       </w:pPr>
       <w:r>
         <w:t>•</w:t>
@@ -753,23 +817,35 @@
       </w:r>
       <w:r>
         <w:rPr>
+          <w:rFonts w:hint="eastAsia"/>
           <w:b/>
+          <w:lang w:eastAsia="zh-CN"/>
         </w:rPr>
-        <w:t>检测与实时调度：</w:t>
+        <w:t>检测与实时调度：基于自训</w:t>
       </w:r>
       <w:r>
-        <w:t>YOLOv8 单类检测（自训）2–4 路 1280×720 并发；只留最新帧 + 轮询公平调度避免旧帧堆积；端到端 T0 取帧 → T1 继电器 ≤ 200 ms，拆六段统计 p95 / p99</w:t>
+        <w:rPr>
+          <w:rFonts w:hint="eastAsia"/>
+          <w:lang w:eastAsia="zh-CN"/>
+        </w:rPr>
+        <w:t>YOLOv8单类检测模型，支持2–4路1280×720分辨率视频流并发处理；仅保留最新帧并采用轮询公平调度机制，避免旧帧堆积；端到端响应时延（T0取帧至T1继电器触发）≤200ms，拆分为六个环节统计p95/p99耗时。</w:t>
       </w:r>
     </w:p>
     <w:p>
       <w:pPr>
         <w:spacing w:before="0" w:after="40" w:line="276" w:lineRule="auto"/>
         <w:ind w:left="320" w:hanging="320"/>
+        <w:rPr>
+          <w:rFonts w:hint="eastAsia" w:eastAsia="宋体"/>
+          <w:lang w:eastAsia="zh-CN"/>
+        </w:rPr>
       </w:pPr>
       <w:r>
-        <w:t>•</w:t>
-        <w:tab/>
-        <w:t>安全口径（系统侧）：启动默认锁机、心跳超时强制锁机，复位需「全局人数为 0 + 所有 ON/IN 区无人 + 无故障」三条同时满足；我参与算法侧验收：故障注入（相机断线 / 推理超时）时必须 100% 进入锁机，不允许静默降级</w:t>
+        <w:rPr>
+          <w:rFonts w:hint="eastAsia"/>
+          <w:lang w:eastAsia="zh-CN"/>
+        </w:rPr>
+        <w:t>•安全口径（系统侧）：系统启动默认锁机，心跳超时强制触发锁机；复位需同时满足“全局人数为0、所有ON/IN区域无人、无故障”三个条件；本人参与算法侧验收工作：在故障注入（相机断线/推理超时）测试中，系统必须100%进入锁机状态，不允许静默降级。</w:t>
       </w:r>
     </w:p>
     <w:p>
@@ -837,7 +913,7 @@
     <w:p>
       <w:pPr>
         <w:spacing w:before="0" w:after="20" w:line="276" w:lineRule="auto"/>
-        <w:ind w:left="400" w:hanging="400" w:hangingChars="200"/>
+        <w:ind w:left="400" w:hanging="440" w:hangingChars="200"/>
         <w:rPr>
           <w:rFonts w:ascii="微软雅黑" w:hAnsi="微软雅黑" w:eastAsia="微软雅黑"/>
           <w:b w:val="0"/>
@@ -845,8 +921,6 @@
           <w:sz w:val="20"/>
         </w:rPr>
       </w:pPr>
-      <w:bookmarkStart w:id="0" w:name="_GoBack"/>
-      <w:bookmarkEnd w:id="0"/>
       <w:r>
         <w:t>•</w:t>
       </w:r>
@@ -860,7 +934,7 @@
     <w:p>
       <w:pPr>
         <w:spacing w:before="0" w:after="20" w:line="276" w:lineRule="auto"/>
-        <w:ind w:left="400" w:hanging="400" w:hangingChars="200"/>
+        <w:ind w:left="400" w:hanging="440" w:hangingChars="200"/>
         <w:rPr>
           <w:rFonts w:ascii="微软雅黑" w:hAnsi="微软雅黑" w:eastAsia="微软雅黑"/>
           <w:b w:val="0"/>
@@ -868,8 +942,6 @@
           <w:sz w:val="20"/>
         </w:rPr>
       </w:pPr>
-      <w:bookmarkStart w:id="0" w:name="_GoBack"/>
-      <w:bookmarkEnd w:id="0"/>
       <w:r>
         <w:t>•</w:t>
       </w:r>
@@ -1155,7 +1227,7 @@
     <w:lsdException w:uiPriority="99" w:name="Normal Indent"/>
     <w:lsdException w:uiPriority="99" w:name="footnote text"/>
     <w:lsdException w:uiPriority="99" w:name="annotation text"/>
-    <w:lsdException w:uiPriority="99" w:semiHidden="0" w:name="header"/>
+    <w:lsdException w:qFormat="1" w:uiPriority="99" w:semiHidden="0" w:name="header"/>
     <w:lsdException w:uiPriority="99" w:semiHidden="0" w:name="footer"/>
     <w:lsdException w:uiPriority="99" w:name="index heading"/>
     <w:lsdException w:qFormat="1" w:uiPriority="35" w:name="caption"/>
@@ -1169,12 +1241,12 @@
     <w:lsdException w:uiPriority="99" w:name="endnote reference"/>
     <w:lsdException w:uiPriority="99" w:name="endnote text"/>
     <w:lsdException w:uiPriority="99" w:name="table of authorities"/>
-    <w:lsdException w:uiPriority="99" w:semiHidden="0" w:name="macro"/>
+    <w:lsdException w:qFormat="1" w:uiPriority="99" w:semiHidden="0" w:name="macro"/>
     <w:lsdException w:uiPriority="99" w:name="toa heading"/>
     <w:lsdException w:qFormat="1" w:uiPriority="99" w:semiHidden="0" w:name="List"/>
     <w:lsdException w:qFormat="1" w:uiPriority="99" w:semiHidden="0" w:name="List Bullet"/>
     <w:lsdException w:qFormat="1" w:uiPriority="99" w:semiHidden="0" w:name="List Number"/>
-    <w:lsdException w:uiPriority="99" w:semiHidden="0" w:name="List 2"/>
+    <w:lsdException w:qFormat="1" w:uiPriority="99" w:semiHidden="0" w:name="List 2"/>
     <w:lsdException w:qFormat="1" w:uiPriority="99" w:semiHidden="0" w:name="List 3"/>
     <w:lsdException w:uiPriority="99" w:name="List 4"/>
     <w:lsdException w:uiPriority="99" w:name="List 5"/>
@@ -1189,7 +1261,7 @@
     <w:lsdException w:qFormat="1" w:unhideWhenUsed="0" w:uiPriority="10" w:semiHidden="0" w:name="Title"/>
     <w:lsdException w:uiPriority="99" w:name="Closing"/>
     <w:lsdException w:uiPriority="99" w:name="Signature"/>
-    <w:lsdException w:uiPriority="1" w:name="Default Paragraph Font"/>
+    <w:lsdException w:qFormat="1" w:uiPriority="1" w:name="Default Paragraph Font"/>
     <w:lsdException w:qFormat="1" w:uiPriority="99" w:semiHidden="0" w:name="Body Text"/>
     <w:lsdException w:uiPriority="99" w:name="Body Text Indent"/>
     <w:lsdException w:uiPriority="99" w:semiHidden="0" w:name="List Continue"/>
@@ -1216,7 +1288,7 @@
     <w:lsdException w:uiPriority="99" w:name="Document Map"/>
     <w:lsdException w:uiPriority="99" w:name="Plain Text"/>
     <w:lsdException w:uiPriority="99" w:name="E-mail Signature"/>
-    <w:lsdException w:uiPriority="99" w:name="Normal (Web)"/>
+    <w:lsdException w:qFormat="1" w:uiPriority="99" w:name="Normal (Web)"/>
     <w:lsdException w:uiPriority="99" w:name="HTML Acronym"/>
     <w:lsdException w:uiPriority="99" w:name="HTML Address"/>
     <w:lsdException w:uiPriority="99" w:name="HTML Cite"/>
@@ -1395,7 +1467,7 @@
     <w:name w:val="heading 1"/>
     <w:basedOn w:val="1"/>
     <w:next w:val="1"/>
-    <w:link w:val="138"/>
+    <w:link w:val="139"/>
     <w:qFormat/>
     <w:uiPriority w:val="9"/>
     <w:pPr>
@@ -1417,7 +1489,7 @@
     <w:name w:val="heading 2"/>
     <w:basedOn w:val="1"/>
     <w:next w:val="1"/>
-    <w:link w:val="139"/>
+    <w:link w:val="140"/>
     <w:unhideWhenUsed/>
     <w:qFormat/>
     <w:uiPriority w:val="9"/>
@@ -1445,7 +1517,7 @@
     <w:name w:val="heading 3"/>
     <w:basedOn w:val="1"/>
     <w:next w:val="1"/>
-    <w:link w:val="140"/>
+    <w:link w:val="141"/>
     <w:unhideWhenUsed/>
     <w:qFormat/>
     <w:uiPriority w:val="9"/>
@@ -1471,7 +1543,7 @@
     <w:name w:val="heading 4"/>
     <w:basedOn w:val="1"/>
     <w:next w:val="1"/>
-    <w:link w:val="150"/>
+    <w:link w:val="151"/>
     <w:semiHidden/>
     <w:unhideWhenUsed/>
     <w:qFormat/>
@@ -1500,7 +1572,7 @@
     <w:name w:val="heading 5"/>
     <w:basedOn w:val="1"/>
     <w:next w:val="1"/>
-    <w:link w:val="151"/>
+    <w:link w:val="152"/>
     <w:semiHidden/>
     <w:unhideWhenUsed/>
     <w:qFormat/>
@@ -1520,7 +1592,7 @@
     <w:name w:val="heading 6"/>
     <w:basedOn w:val="1"/>
     <w:next w:val="1"/>
-    <w:link w:val="152"/>
+    <w:link w:val="153"/>
     <w:semiHidden/>
     <w:unhideWhenUsed/>
     <w:qFormat/>
@@ -1542,7 +1614,7 @@
     <w:name w:val="heading 7"/>
     <w:basedOn w:val="1"/>
     <w:next w:val="1"/>
-    <w:link w:val="153"/>
+    <w:link w:val="154"/>
     <w:semiHidden/>
     <w:unhideWhenUsed/>
     <w:qFormat/>
@@ -1572,7 +1644,7 @@
     <w:name w:val="heading 8"/>
     <w:basedOn w:val="1"/>
     <w:next w:val="1"/>
-    <w:link w:val="154"/>
+    <w:link w:val="155"/>
     <w:semiHidden/>
     <w:unhideWhenUsed/>
     <w:qFormat/>
@@ -1599,7 +1671,7 @@
     <w:name w:val="heading 9"/>
     <w:basedOn w:val="1"/>
     <w:next w:val="1"/>
-    <w:link w:val="155"/>
+    <w:link w:val="156"/>
     <w:semiHidden/>
     <w:unhideWhenUsed/>
     <w:qFormat/>
@@ -1627,13 +1699,14 @@
       </w14:textFill>
     </w:rPr>
   </w:style>
-  <w:style w:type="character" w:default="1" w:styleId="132">
+  <w:style w:type="character" w:default="1" w:styleId="133">
     <w:name w:val="Default Paragraph Font"/>
     <w:semiHidden/>
     <w:unhideWhenUsed/>
+    <w:qFormat/>
     <w:uiPriority w:val="1"/>
   </w:style>
-  <w:style w:type="table" w:default="1" w:styleId="32">
+  <w:style w:type="table" w:default="1" w:styleId="33">
     <w:name w:val="Normal Table"/>
     <w:semiHidden/>
     <w:unhideWhenUsed/>
@@ -1650,8 +1723,9 @@
   </w:style>
   <w:style w:type="paragraph" w:styleId="2">
     <w:name w:val="macro"/>
-    <w:link w:val="147"/>
+    <w:link w:val="148"/>
     <w:unhideWhenUsed/>
+    <w:qFormat/>
     <w:uiPriority w:val="99"/>
     <w:pPr>
       <w:tabs>
@@ -1752,7 +1826,7 @@
   <w:style w:type="paragraph" w:styleId="17">
     <w:name w:val="Body Text 3"/>
     <w:basedOn w:val="1"/>
-    <w:link w:val="146"/>
+    <w:link w:val="147"/>
     <w:unhideWhenUsed/>
     <w:qFormat/>
     <w:uiPriority w:val="99"/>
@@ -1781,7 +1855,7 @@
   <w:style w:type="paragraph" w:styleId="19">
     <w:name w:val="Body Text"/>
     <w:basedOn w:val="1"/>
-    <w:link w:val="144"/>
+    <w:link w:val="145"/>
     <w:unhideWhenUsed/>
     <w:qFormat/>
     <w:uiPriority w:val="99"/>
@@ -1807,6 +1881,7 @@
     <w:name w:val="List 2"/>
     <w:basedOn w:val="1"/>
     <w:unhideWhenUsed/>
+    <w:qFormat/>
     <w:uiPriority w:val="99"/>
     <w:pPr>
       <w:ind w:left="720" w:hanging="360"/>
@@ -1841,7 +1916,7 @@
   <w:style w:type="paragraph" w:styleId="24">
     <w:name w:val="footer"/>
     <w:basedOn w:val="1"/>
-    <w:link w:val="136"/>
+    <w:link w:val="137"/>
     <w:unhideWhenUsed/>
     <w:uiPriority w:val="99"/>
     <w:pPr>
@@ -1855,8 +1930,9 @@
   <w:style w:type="paragraph" w:styleId="25">
     <w:name w:val="header"/>
     <w:basedOn w:val="1"/>
-    <w:link w:val="135"/>
+    <w:link w:val="136"/>
     <w:unhideWhenUsed/>
+    <w:qFormat/>
     <w:uiPriority w:val="99"/>
     <w:pPr>
       <w:tabs>
@@ -1870,7 +1946,7 @@
     <w:name w:val="Subtitle"/>
     <w:basedOn w:val="1"/>
     <w:next w:val="1"/>
-    <w:link w:val="142"/>
+    <w:link w:val="143"/>
     <w:qFormat/>
     <w:uiPriority w:val="11"/>
     <w:rPr>
@@ -1902,7 +1978,7 @@
   <w:style w:type="paragraph" w:styleId="28">
     <w:name w:val="Body Text 2"/>
     <w:basedOn w:val="1"/>
-    <w:link w:val="145"/>
+    <w:link w:val="146"/>
     <w:unhideWhenUsed/>
     <w:qFormat/>
     <w:uiPriority w:val="99"/>
@@ -1922,6 +1998,24 @@
     </w:pPr>
   </w:style>
   <w:style w:type="paragraph" w:styleId="30">
+    <w:name w:val="Normal (Web)"/>
+    <w:basedOn w:val="1"/>
+    <w:semiHidden/>
+    <w:unhideWhenUsed/>
+    <w:qFormat/>
+    <w:uiPriority w:val="99"/>
+    <w:pPr>
+      <w:spacing w:before="0" w:beforeAutospacing="1" w:after="0" w:afterAutospacing="1"/>
+      <w:ind w:left="0" w:right="0"/>
+      <w:jc w:val="left"/>
+    </w:pPr>
+    <w:rPr>
+      <w:kern w:val="0"/>
+      <w:sz w:val="24"/>
+      <w:lang w:val="en-US" w:eastAsia="zh-CN" w:bidi="ar"/>
+    </w:rPr>
+  </w:style>
+  <w:style w:type="paragraph" w:styleId="31">
     <w:name w:val="List Continue 3"/>
     <w:basedOn w:val="1"/>
     <w:unhideWhenUsed/>
@@ -1932,11 +2026,11 @@
       <w:contextualSpacing/>
     </w:pPr>
   </w:style>
-  <w:style w:type="paragraph" w:styleId="31">
+  <w:style w:type="paragraph" w:styleId="32">
     <w:name w:val="Title"/>
     <w:basedOn w:val="1"/>
     <w:next w:val="1"/>
-    <w:link w:val="141"/>
+    <w:link w:val="142"/>
     <w:qFormat/>
     <w:uiPriority w:val="10"/>
     <w:pPr>
@@ -1955,9 +2049,9 @@
       <w:szCs w:val="52"/>
     </w:rPr>
   </w:style>
-  <w:style w:type="table" w:styleId="33">
+  <w:style w:type="table" w:styleId="34">
     <w:name w:val="Table Grid"/>
-    <w:basedOn w:val="32"/>
+    <w:basedOn w:val="33"/>
     <w:qFormat/>
     <w:uiPriority w:val="59"/>
     <w:pPr>
@@ -1980,9 +2074,9 @@
       </w:tblCellMar>
     </w:tblPr>
   </w:style>
-  <w:style w:type="table" w:styleId="34">
+  <w:style w:type="table" w:styleId="35">
     <w:name w:val="Light Shading"/>
-    <w:basedOn w:val="32"/>
+    <w:basedOn w:val="33"/>
     <w:qFormat/>
     <w:uiPriority w:val="60"/>
     <w:pPr>
@@ -2080,9 +2174,9 @@
       </w:tcPr>
     </w:tblStylePr>
   </w:style>
-  <w:style w:type="table" w:styleId="35">
+  <w:style w:type="table" w:styleId="36">
     <w:name w:val="Light Shading Accent 1"/>
-    <w:basedOn w:val="32"/>
+    <w:basedOn w:val="33"/>
     <w:qFormat/>
     <w:uiPriority w:val="60"/>
     <w:pPr>
@@ -2180,9 +2274,9 @@
       </w:tcPr>
     </w:tblStylePr>
   </w:style>
-  <w:style w:type="table" w:styleId="36">
+  <w:style w:type="table" w:styleId="37">
     <w:name w:val="Light Shading Accent 2"/>
-    <w:basedOn w:val="32"/>
+    <w:basedOn w:val="33"/>
     <w:qFormat/>
     <w:uiPriority w:val="60"/>
     <w:pPr>
@@ -2280,9 +2374,9 @@
       </w:tcPr>
     </w:tblStylePr>
   </w:style>
-  <w:style w:type="table" w:styleId="37">
+  <w:style w:type="table" w:styleId="38">
     <w:name w:val="Light Shading Accent 3"/>
-    <w:basedOn w:val="32"/>
+    <w:basedOn w:val="33"/>
     <w:qFormat/>
     <w:uiPriority w:val="60"/>
     <w:pPr>
@@ -2380,9 +2474,9 @@
       </w:tcPr>
     </w:tblStylePr>
   </w:style>
-  <w:style w:type="table" w:styleId="38">
+  <w:style w:type="table" w:styleId="39">
     <w:name w:val="Light Shading Accent 4"/>
-    <w:basedOn w:val="32"/>
+    <w:basedOn w:val="33"/>
     <w:qFormat/>
     <w:uiPriority w:val="60"/>
     <w:pPr>
@@ -2480,9 +2574,9 @@
       </w:tcPr>
     </w:tblStylePr>
   </w:style>
-  <w:style w:type="table" w:styleId="39">
+  <w:style w:type="table" w:styleId="40">
     <w:name w:val="Light Shading Accent 5"/>
-    <w:basedOn w:val="32"/>
+    <w:basedOn w:val="33"/>
     <w:qFormat/>
     <w:uiPriority w:val="60"/>
     <w:pPr>
@@ -2580,9 +2674,9 @@
       </w:tcPr>
     </w:tblStylePr>
   </w:style>
-  <w:style w:type="table" w:styleId="40">
+  <w:style w:type="table" w:styleId="41">
     <w:name w:val="Light Shading Accent 6"/>
-    <w:basedOn w:val="32"/>
+    <w:basedOn w:val="33"/>
     <w:qFormat/>
     <w:uiPriority w:val="60"/>
     <w:pPr>
@@ -2680,9 +2774,9 @@
       </w:tcPr>
     </w:tblStylePr>
   </w:style>
-  <w:style w:type="table" w:styleId="41">
+  <w:style w:type="table" w:styleId="42">
     <w:name w:val="Light List"/>
-    <w:basedOn w:val="32"/>
+    <w:basedOn w:val="33"/>
     <w:qFormat/>
     <w:uiPriority w:val="61"/>
     <w:pPr>
@@ -2774,9 +2868,9 @@
       </w:tcPr>
     </w:tblStylePr>
   </w:style>
-  <w:style w:type="table" w:styleId="42">
+  <w:style w:type="table" w:styleId="43">
     <w:name w:val="Light List Accent 1"/>
-    <w:basedOn w:val="32"/>
+    <w:basedOn w:val="33"/>
     <w:qFormat/>
     <w:uiPriority w:val="61"/>
     <w:pPr>
@@ -2868,9 +2962,9 @@
       </w:tcPr>
     </w:tblStylePr>
   </w:style>
-  <w:style w:type="table" w:styleId="43">
+  <w:style w:type="table" w:styleId="44">
     <w:name w:val="Light List Accent 2"/>
-    <w:basedOn w:val="32"/>
+    <w:basedOn w:val="33"/>
     <w:qFormat/>
     <w:uiPriority w:val="61"/>
     <w:pPr>
@@ -2962,9 +3056,9 @@
       </w:tcPr>
     </w:tblStylePr>
   </w:style>
-  <w:style w:type="table" w:styleId="44">
+  <w:style w:type="table" w:styleId="45">
     <w:name w:val="Light List Accent 3"/>
-    <w:basedOn w:val="32"/>
+    <w:basedOn w:val="33"/>
     <w:qFormat/>
     <w:uiPriority w:val="61"/>
     <w:pPr>
@@ -3056,9 +3150,9 @@
       </w:tcPr>
     </w:tblStylePr>
   </w:style>
-  <w:style w:type="table" w:styleId="45">
+  <w:style w:type="table" w:styleId="46">
     <w:name w:val="Light List Accent 4"/>
-    <w:basedOn w:val="32"/>
+    <w:basedOn w:val="33"/>
     <w:qFormat/>
     <w:uiPriority w:val="61"/>
     <w:pPr>
@@ -3150,9 +3244,9 @@
       </w:tcPr>
     </w:tblStylePr>
   </w:style>
-  <w:style w:type="table" w:styleId="46">
+  <w:style w:type="table" w:styleId="47">
     <w:name w:val="Light List Accent 5"/>
-    <w:basedOn w:val="32"/>
+    <w:basedOn w:val="33"/>
     <w:qFormat/>
     <w:uiPriority w:val="61"/>
     <w:pPr>
@@ -3244,9 +3338,9 @@
       </w:tcPr>
     </w:tblStylePr>
   </w:style>
-  <w:style w:type="table" w:styleId="47">
+  <w:style w:type="table" w:styleId="48">
     <w:name w:val="Light List Accent 6"/>
-    <w:basedOn w:val="32"/>
+    <w:basedOn w:val="33"/>
     <w:qFormat/>
     <w:uiPriority w:val="61"/>
     <w:pPr>
@@ -3338,9 +3432,9 @@
       </w:tcPr>
     </w:tblStylePr>
   </w:style>
-  <w:style w:type="table" w:styleId="48">
+  <w:style w:type="table" w:styleId="49">
     <w:name w:val="Light Grid"/>
-    <w:basedOn w:val="32"/>
+    <w:basedOn w:val="33"/>
     <w:qFormat/>
     <w:uiPriority w:val="62"/>
     <w:pPr>
@@ -3465,9 +3559,9 @@
       </w:tcPr>
     </w:tblStylePr>
   </w:style>
-  <w:style w:type="table" w:styleId="49">
+  <w:style w:type="table" w:styleId="50">
     <w:name w:val="Light Grid Accent 1"/>
-    <w:basedOn w:val="32"/>
+    <w:basedOn w:val="33"/>
     <w:qFormat/>
     <w:uiPriority w:val="62"/>
     <w:pPr>
@@ -3592,9 +3686,9 @@
       </w:tcPr>
     </w:tblStylePr>
   </w:style>
-  <w:style w:type="table" w:styleId="50">
+  <w:style w:type="table" w:styleId="51">
     <w:name w:val="Light Grid Accent 2"/>
-    <w:basedOn w:val="32"/>
+    <w:basedOn w:val="33"/>
     <w:qFormat/>
     <w:uiPriority w:val="62"/>
     <w:pPr>
@@ -3719,9 +3813,9 @@
       </w:tcPr>
     </w:tblStylePr>
   </w:style>
-  <w:style w:type="table" w:styleId="51">
+  <w:style w:type="table" w:styleId="52">
     <w:name w:val="Light Grid Accent 3"/>
-    <w:basedOn w:val="32"/>
+    <w:basedOn w:val="33"/>
     <w:qFormat/>
     <w:uiPriority w:val="62"/>
     <w:pPr>
@@ -3846,9 +3940,9 @@
       </w:tcPr>
     </w:tblStylePr>
   </w:style>
-  <w:style w:type="table" w:styleId="52">
+  <w:style w:type="table" w:styleId="53">
     <w:name w:val="Light Grid Accent 4"/>
-    <w:basedOn w:val="32"/>
+    <w:basedOn w:val="33"/>
     <w:qFormat/>
     <w:uiPriority w:val="62"/>
     <w:pPr>
@@ -3973,9 +4067,9 @@
       </w:tcPr>
     </w:tblStylePr>
   </w:style>
-  <w:style w:type="table" w:styleId="53">
+  <w:style w:type="table" w:styleId="54">
     <w:name w:val="Light Grid Accent 5"/>
-    <w:basedOn w:val="32"/>
+    <w:basedOn w:val="33"/>
     <w:qFormat/>
     <w:uiPriority w:val="62"/>
     <w:pPr>
@@ -4100,9 +4194,9 @@
       </w:tcPr>
     </w:tblStylePr>
   </w:style>
-  <w:style w:type="table" w:styleId="54">
+  <w:style w:type="table" w:styleId="55">
     <w:name w:val="Light Grid Accent 6"/>
-    <w:basedOn w:val="32"/>
+    <w:basedOn w:val="33"/>
     <w:qFormat/>
     <w:uiPriority w:val="62"/>
     <w:pPr>
@@ -4227,9 +4321,9 @@
       </w:tcPr>
     </w:tblStylePr>
   </w:style>
-  <w:style w:type="table" w:styleId="55">
+  <w:style w:type="table" w:styleId="56">
     <w:name w:val="Medium Shading 1"/>
-    <w:basedOn w:val="32"/>
+    <w:basedOn w:val="33"/>
     <w:qFormat/>
     <w:uiPriority w:val="63"/>
     <w:pPr>
@@ -4335,9 +4429,9 @@
       </w:tcPr>
     </w:tblStylePr>
   </w:style>
-  <w:style w:type="table" w:styleId="56">
+  <w:style w:type="table" w:styleId="57">
     <w:name w:val="Medium Shading 1 Accent 1"/>
-    <w:basedOn w:val="32"/>
+    <w:basedOn w:val="33"/>
     <w:qFormat/>
     <w:uiPriority w:val="63"/>
     <w:pPr>
@@ -4443,9 +4537,9 @@
       </w:tcPr>
     </w:tblStylePr>
   </w:style>
-  <w:style w:type="table" w:styleId="57">
+  <w:style w:type="table" w:styleId="58">
     <w:name w:val="Medium Shading 1 Accent 2"/>
-    <w:basedOn w:val="32"/>
+    <w:basedOn w:val="33"/>
     <w:qFormat/>
     <w:uiPriority w:val="63"/>
     <w:pPr>
@@ -4551,9 +4645,9 @@
       </w:tcPr>
     </w:tblStylePr>
   </w:style>
-  <w:style w:type="table" w:styleId="58">
+  <w:style w:type="table" w:styleId="59">
     <w:name w:val="Medium Shading 1 Accent 3"/>
-    <w:basedOn w:val="32"/>
+    <w:basedOn w:val="33"/>
     <w:qFormat/>
     <w:uiPriority w:val="63"/>
     <w:pPr>
@@ -4659,9 +4753,9 @@
       </w:tcPr>
     </w:tblStylePr>
   </w:style>
-  <w:style w:type="table" w:styleId="59">
+  <w:style w:type="table" w:styleId="60">
     <w:name w:val="Medium Shading 1 Accent 4"/>
-    <w:basedOn w:val="32"/>
+    <w:basedOn w:val="33"/>
     <w:qFormat/>
     <w:uiPriority w:val="63"/>
     <w:pPr>
@@ -4767,9 +4861,9 @@
       </w:tcPr>
     </w:tblStylePr>
   </w:style>
-  <w:style w:type="table" w:styleId="60">
+  <w:style w:type="table" w:styleId="61">
     <w:name w:val="Medium Shading 1 Accent 5"/>
-    <w:basedOn w:val="32"/>
+    <w:basedOn w:val="33"/>
     <w:qFormat/>
     <w:uiPriority w:val="63"/>
     <w:pPr>
@@ -4875,9 +4969,9 @@
       </w:tcPr>
     </w:tblStylePr>
   </w:style>
-  <w:style w:type="table" w:styleId="61">
+  <w:style w:type="table" w:styleId="62">
     <w:name w:val="Medium Shading 1 Accent 6"/>
-    <w:basedOn w:val="32"/>
+    <w:basedOn w:val="33"/>
     <w:qFormat/>
     <w:uiPriority w:val="63"/>
     <w:pPr>
@@ -4983,9 +5077,9 @@
       </w:tcPr>
     </w:tblStylePr>
   </w:style>
-  <w:style w:type="table" w:styleId="62">
+  <w:style w:type="table" w:styleId="63">
     <w:name w:val="Medium Shading 2"/>
-    <w:basedOn w:val="32"/>
+    <w:basedOn w:val="33"/>
     <w:qFormat/>
     <w:uiPriority w:val="64"/>
     <w:pPr>
@@ -5149,9 +5243,9 @@
       </w:tcPr>
     </w:tblStylePr>
   </w:style>
-  <w:style w:type="table" w:styleId="63">
+  <w:style w:type="table" w:styleId="64">
     <w:name w:val="Medium Shading 2 Accent 1"/>
-    <w:basedOn w:val="32"/>
+    <w:basedOn w:val="33"/>
     <w:qFormat/>
     <w:uiPriority w:val="64"/>
     <w:pPr>
@@ -5315,9 +5409,9 @@
       </w:tcPr>
     </w:tblStylePr>
   </w:style>
-  <w:style w:type="table" w:styleId="64">
+  <w:style w:type="table" w:styleId="65">
     <w:name w:val="Medium Shading 2 Accent 2"/>
-    <w:basedOn w:val="32"/>
+    <w:basedOn w:val="33"/>
     <w:qFormat/>
     <w:uiPriority w:val="64"/>
     <w:pPr>
@@ -5481,9 +5575,9 @@
       </w:tcPr>
     </w:tblStylePr>
   </w:style>
-  <w:style w:type="table" w:styleId="65">
+  <w:style w:type="table" w:styleId="66">
     <w:name w:val="Medium Shading 2 Accent 3"/>
-    <w:basedOn w:val="32"/>
+    <w:basedOn w:val="33"/>
     <w:qFormat/>
     <w:uiPriority w:val="64"/>
     <w:pPr>
@@ -5647,9 +5741,9 @@
       </w:tcPr>
     </w:tblStylePr>
   </w:style>
-  <w:style w:type="table" w:styleId="66">
+  <w:style w:type="table" w:styleId="67">
     <w:name w:val="Medium Shading 2 Accent 4"/>
-    <w:basedOn w:val="32"/>
+    <w:basedOn w:val="33"/>
     <w:qFormat/>
     <w:uiPriority w:val="64"/>
     <w:pPr>
@@ -5813,9 +5907,9 @@
       </w:tcPr>
     </w:tblStylePr>
   </w:style>
-  <w:style w:type="table" w:styleId="67">
+  <w:style w:type="table" w:styleId="68">
     <w:name w:val="Medium Shading 2 Accent 5"/>
-    <w:basedOn w:val="32"/>
+    <w:basedOn w:val="33"/>
     <w:qFormat/>
     <w:uiPriority w:val="64"/>
     <w:pPr>
@@ -5979,9 +6073,9 @@
       </w:tcPr>
     </w:tblStylePr>
   </w:style>
-  <w:style w:type="table" w:styleId="68">
+  <w:style w:type="table" w:styleId="69">
     <w:name w:val="Medium Shading 2 Accent 6"/>
-    <w:basedOn w:val="32"/>
+    <w:basedOn w:val="33"/>
     <w:qFormat/>
     <w:uiPriority w:val="64"/>
     <w:pPr>
@@ -6145,9 +6239,9 @@
       </w:tcPr>
     </w:tblStylePr>
   </w:style>
-  <w:style w:type="table" w:styleId="69">
+  <w:style w:type="table" w:styleId="70">
     <w:name w:val="Medium List 1"/>
-    <w:basedOn w:val="32"/>
+    <w:basedOn w:val="33"/>
     <w:qFormat/>
     <w:uiPriority w:val="65"/>
     <w:pPr>
@@ -6236,9 +6330,9 @@
       </w:tcPr>
     </w:tblStylePr>
   </w:style>
-  <w:style w:type="table" w:styleId="70">
+  <w:style w:type="table" w:styleId="71">
     <w:name w:val="Medium List 1 Accent 1"/>
-    <w:basedOn w:val="32"/>
+    <w:basedOn w:val="33"/>
     <w:qFormat/>
     <w:uiPriority w:val="65"/>
     <w:pPr>
@@ -6327,9 +6421,9 @@
       </w:tcPr>
     </w:tblStylePr>
   </w:style>
-  <w:style w:type="table" w:styleId="71">
+  <w:style w:type="table" w:styleId="72">
     <w:name w:val="Medium List 1 Accent 2"/>
-    <w:basedOn w:val="32"/>
+    <w:basedOn w:val="33"/>
     <w:qFormat/>
     <w:uiPriority w:val="65"/>
     <w:pPr>
@@ -6418,9 +6512,9 @@
       </w:tcPr>
     </w:tblStylePr>
   </w:style>
-  <w:style w:type="table" w:styleId="72">
+  <w:style w:type="table" w:styleId="73">
     <w:name w:val="Medium List 1 Accent 3"/>
-    <w:basedOn w:val="32"/>
+    <w:basedOn w:val="33"/>
     <w:qFormat/>
     <w:uiPriority w:val="65"/>
     <w:pPr>
@@ -6509,9 +6603,9 @@
       </w:tcPr>
     </w:tblStylePr>
   </w:style>
-  <w:style w:type="table" w:styleId="73">
+  <w:style w:type="table" w:styleId="74">
     <w:name w:val="Medium List 1 Accent 4"/>
-    <w:basedOn w:val="32"/>
+    <w:basedOn w:val="33"/>
     <w:qFormat/>
     <w:uiPriority w:val="65"/>
     <w:pPr>
@@ -6600,9 +6694,9 @@
       </w:tcPr>
     </w:tblStylePr>
   </w:style>
-  <w:style w:type="table" w:styleId="74">
+  <w:style w:type="table" w:styleId="75">
     <w:name w:val="Medium List 1 Accent 5"/>
-    <w:basedOn w:val="32"/>
+    <w:basedOn w:val="33"/>
     <w:qFormat/>
     <w:uiPriority w:val="65"/>
     <w:pPr>
@@ -6691,9 +6785,9 @@
       </w:tcPr>
     </w:tblStylePr>
   </w:style>
-  <w:style w:type="table" w:styleId="75">
+  <w:style w:type="table" w:styleId="76">
     <w:name w:val="Medium List 1 Accent 6"/>
-    <w:basedOn w:val="32"/>
+    <w:basedOn w:val="33"/>
     <w:qFormat/>
     <w:uiPriority w:val="65"/>
     <w:pPr>
@@ -6782,9 +6876,9 @@
       </w:tcPr>
     </w:tblStylePr>
   </w:style>
-  <w:style w:type="table" w:styleId="76">
+  <w:style w:type="table" w:styleId="77">
     <w:name w:val="Medium List 2"/>
-    <w:basedOn w:val="32"/>
+    <w:basedOn w:val="33"/>
     <w:qFormat/>
     <w:uiPriority w:val="66"/>
     <w:pPr>
@@ -6912,9 +7006,9 @@
       </w:tcPr>
     </w:tblStylePr>
   </w:style>
-  <w:style w:type="table" w:styleId="77">
+  <w:style w:type="table" w:styleId="78">
     <w:name w:val="Medium List 2 Accent 1"/>
-    <w:basedOn w:val="32"/>
+    <w:basedOn w:val="33"/>
     <w:qFormat/>
     <w:uiPriority w:val="66"/>
     <w:pPr>
@@ -7042,9 +7136,9 @@
       </w:tcPr>
     </w:tblStylePr>
   </w:style>
-  <w:style w:type="table" w:styleId="78">
+  <w:style w:type="table" w:styleId="79">
     <w:name w:val="Medium List 2 Accent 2"/>
-    <w:basedOn w:val="32"/>
+    <w:basedOn w:val="33"/>
     <w:qFormat/>
     <w:uiPriority w:val="66"/>
     <w:pPr>
@@ -7172,9 +7266,9 @@
       </w:tcPr>
     </w:tblStylePr>
   </w:style>
-  <w:style w:type="table" w:styleId="79">
+  <w:style w:type="table" w:styleId="80">
     <w:name w:val="Medium List 2 Accent 3"/>
-    <w:basedOn w:val="32"/>
+    <w:basedOn w:val="33"/>
     <w:qFormat/>
     <w:uiPriority w:val="66"/>
     <w:pPr>
@@ -7302,9 +7396,9 @@
       </w:tcPr>
     </w:tblStylePr>
   </w:style>
-  <w:style w:type="table" w:styleId="80">
+  <w:style w:type="table" w:styleId="81">
     <w:name w:val="Medium List 2 Accent 4"/>
-    <w:basedOn w:val="32"/>
+    <w:basedOn w:val="33"/>
     <w:qFormat/>
     <w:uiPriority w:val="66"/>
     <w:pPr>
@@ -7432,9 +7526,9 @@
       </w:tcPr>
     </w:tblStylePr>
   </w:style>
-  <w:style w:type="table" w:styleId="81">
+  <w:style w:type="table" w:styleId="82">
     <w:name w:val="Medium List 2 Accent 5"/>
-    <w:basedOn w:val="32"/>
+    <w:basedOn w:val="33"/>
     <w:qFormat/>
     <w:uiPriority w:val="66"/>
     <w:pPr>
@@ -7562,9 +7656,9 @@
       </w:tcPr>
     </w:tblStylePr>
   </w:style>
-  <w:style w:type="table" w:styleId="82">
+  <w:style w:type="table" w:styleId="83">
     <w:name w:val="Medium List 2 Accent 6"/>
-    <w:basedOn w:val="32"/>
+    <w:basedOn w:val="33"/>
     <w:qFormat/>
     <w:uiPriority w:val="66"/>
     <w:pPr>
@@ -7692,9 +7786,9 @@
       </w:tcPr>
     </w:tblStylePr>
   </w:style>
-  <w:style w:type="table" w:styleId="83">
+  <w:style w:type="table" w:styleId="84">
     <w:name w:val="Medium Grid 1"/>
-    <w:basedOn w:val="32"/>
+    <w:basedOn w:val="33"/>
     <w:qFormat/>
     <w:uiPriority w:val="67"/>
     <w:pPr>
@@ -7762,9 +7856,9 @@
       </w:tcPr>
     </w:tblStylePr>
   </w:style>
-  <w:style w:type="table" w:styleId="84">
+  <w:style w:type="table" w:styleId="85">
     <w:name w:val="Medium Grid 1 Accent 1"/>
-    <w:basedOn w:val="32"/>
+    <w:basedOn w:val="33"/>
     <w:qFormat/>
     <w:uiPriority w:val="67"/>
     <w:pPr>
@@ -7832,9 +7926,9 @@
       </w:tcPr>
     </w:tblStylePr>
   </w:style>
-  <w:style w:type="table" w:styleId="85">
+  <w:style w:type="table" w:styleId="86">
     <w:name w:val="Medium Grid 1 Accent 2"/>
-    <w:basedOn w:val="32"/>
+    <w:basedOn w:val="33"/>
     <w:qFormat/>
     <w:uiPriority w:val="67"/>
     <w:pPr>
@@ -7902,9 +7996,9 @@
       </w:tcPr>
     </w:tblStylePr>
   </w:style>
-  <w:style w:type="table" w:styleId="86">
+  <w:style w:type="table" w:styleId="87">
     <w:name w:val="Medium Grid 1 Accent 3"/>
-    <w:basedOn w:val="32"/>
+    <w:basedOn w:val="33"/>
     <w:qFormat/>
     <w:uiPriority w:val="67"/>
     <w:pPr>
@@ -7972,9 +8066,9 @@
       </w:tcPr>
     </w:tblStylePr>
   </w:style>
-  <w:style w:type="table" w:styleId="87">
+  <w:style w:type="table" w:styleId="88">
     <w:name w:val="Medium Grid 1 Accent 4"/>
-    <w:basedOn w:val="32"/>
+    <w:basedOn w:val="33"/>
     <w:qFormat/>
     <w:uiPriority w:val="67"/>
     <w:pPr>
@@ -8042,9 +8136,9 @@
       </w:tcPr>
     </w:tblStylePr>
   </w:style>
-  <w:style w:type="table" w:styleId="88">
+  <w:style w:type="table" w:styleId="89">
     <w:name w:val="Medium Grid 1 Accent 5"/>
-    <w:basedOn w:val="32"/>
+    <w:basedOn w:val="33"/>
     <w:qFormat/>
     <w:uiPriority w:val="67"/>
     <w:pPr>
@@ -8112,9 +8206,9 @@
       </w:tcPr>
     </w:tblStylePr>
   </w:style>
-  <w:style w:type="table" w:styleId="89">
+  <w:style w:type="table" w:styleId="90">
     <w:name w:val="Medium Grid 1 Accent 6"/>
-    <w:basedOn w:val="32"/>
+    <w:basedOn w:val="33"/>
     <w:qFormat/>
     <w:uiPriority w:val="67"/>
     <w:pPr>
@@ -8182,9 +8276,9 @@
       </w:tcPr>
     </w:tblStylePr>
   </w:style>
-  <w:style w:type="table" w:styleId="90">
+  <w:style w:type="table" w:styleId="91">
     <w:name w:val="Medium Grid 2"/>
-    <w:basedOn w:val="32"/>
+    <w:basedOn w:val="33"/>
     <w:qFormat/>
     <w:uiPriority w:val="68"/>
     <w:pPr>
@@ -8329,9 +8423,9 @@
       </w:tcPr>
     </w:tblStylePr>
   </w:style>
-  <w:style w:type="table" w:styleId="91">
+  <w:style w:type="table" w:styleId="92">
     <w:name w:val="Medium Grid 2 Accent 1"/>
-    <w:basedOn w:val="32"/>
+    <w:basedOn w:val="33"/>
     <w:qFormat/>
     <w:uiPriority w:val="68"/>
     <w:pPr>
@@ -8476,9 +8570,9 @@
       </w:tcPr>
     </w:tblStylePr>
   </w:style>
-  <w:style w:type="table" w:styleId="92">
+  <w:style w:type="table" w:styleId="93">
     <w:name w:val="Medium Grid 2 Accent 2"/>
-    <w:basedOn w:val="32"/>
+    <w:basedOn w:val="33"/>
     <w:qFormat/>
     <w:uiPriority w:val="68"/>
     <w:pPr>
@@ -8623,9 +8717,9 @@
       </w:tcPr>
     </w:tblStylePr>
   </w:style>
-  <w:style w:type="table" w:styleId="93">
+  <w:style w:type="table" w:styleId="94">
     <w:name w:val="Medium Grid 2 Accent 3"/>
-    <w:basedOn w:val="32"/>
+    <w:basedOn w:val="33"/>
     <w:qFormat/>
     <w:uiPriority w:val="68"/>
     <w:pPr>
@@ -8770,9 +8864,9 @@
       </w:tcPr>
     </w:tblStylePr>
   </w:style>
-  <w:style w:type="table" w:styleId="94">
+  <w:style w:type="table" w:styleId="95">
     <w:name w:val="Medium Grid 2 Accent 4"/>
-    <w:basedOn w:val="32"/>
+    <w:basedOn w:val="33"/>
     <w:qFormat/>
     <w:uiPriority w:val="68"/>
     <w:pPr>
@@ -8917,9 +9011,9 @@
       </w:tcPr>
     </w:tblStylePr>
   </w:style>
-  <w:style w:type="table" w:styleId="95">
+  <w:style w:type="table" w:styleId="96">
     <w:name w:val="Medium Grid 2 Accent 5"/>
-    <w:basedOn w:val="32"/>
+    <w:basedOn w:val="33"/>
     <w:qFormat/>
     <w:uiPriority w:val="68"/>
     <w:pPr>
@@ -9064,9 +9158,9 @@
       </w:tcPr>
     </w:tblStylePr>
   </w:style>
-  <w:style w:type="table" w:styleId="96">
+  <w:style w:type="table" w:styleId="97">
     <w:name w:val="Medium Grid 2 Accent 6"/>
-    <w:basedOn w:val="32"/>
+    <w:basedOn w:val="33"/>
     <w:qFormat/>
     <w:uiPriority w:val="68"/>
     <w:pPr>
@@ -9211,9 +9305,9 @@
       </w:tcPr>
     </w:tblStylePr>
   </w:style>
-  <w:style w:type="table" w:styleId="97">
+  <w:style w:type="table" w:styleId="98">
     <w:name w:val="Medium Grid 3"/>
-    <w:basedOn w:val="32"/>
+    <w:basedOn w:val="33"/>
     <w:qFormat/>
     <w:uiPriority w:val="69"/>
     <w:pPr>
@@ -9369,9 +9463,9 @@
       </w:tcPr>
     </w:tblStylePr>
   </w:style>
-  <w:style w:type="table" w:styleId="98">
+  <w:style w:type="table" w:styleId="99">
     <w:name w:val="Medium Grid 3 Accent 1"/>
-    <w:basedOn w:val="32"/>
+    <w:basedOn w:val="33"/>
     <w:qFormat/>
     <w:uiPriority w:val="69"/>
     <w:pPr>
@@ -9527,9 +9621,9 @@
       </w:tcPr>
     </w:tblStylePr>
   </w:style>
-  <w:style w:type="table" w:styleId="99">
+  <w:style w:type="table" w:styleId="100">
     <w:name w:val="Medium Grid 3 Accent 2"/>
-    <w:basedOn w:val="32"/>
+    <w:basedOn w:val="33"/>
     <w:qFormat/>
     <w:uiPriority w:val="69"/>
     <w:pPr>
@@ -9685,9 +9779,9 @@
       </w:tcPr>
     </w:tblStylePr>
   </w:style>
-  <w:style w:type="table" w:styleId="100">
+  <w:style w:type="table" w:styleId="101">
     <w:name w:val="Medium Grid 3 Accent 3"/>
-    <w:basedOn w:val="32"/>
+    <w:basedOn w:val="33"/>
     <w:qFormat/>
     <w:uiPriority w:val="69"/>
     <w:pPr>
@@ -9843,9 +9937,9 @@
       </w:tcPr>
     </w:tblStylePr>
   </w:style>
-  <w:style w:type="table" w:styleId="101">
+  <w:style w:type="table" w:styleId="102">
     <w:name w:val="Medium Grid 3 Accent 4"/>
-    <w:basedOn w:val="32"/>
+    <w:basedOn w:val="33"/>
     <w:qFormat/>
     <w:uiPriority w:val="69"/>
     <w:pPr>
@@ -10001,9 +10095,9 @@
       </w:tcPr>
     </w:tblStylePr>
   </w:style>
-  <w:style w:type="table" w:styleId="102">
+  <w:style w:type="table" w:styleId="103">
     <w:name w:val="Medium Grid 3 Accent 5"/>
-    <w:basedOn w:val="32"/>
+    <w:basedOn w:val="33"/>
     <w:qFormat/>
     <w:uiPriority w:val="69"/>
     <w:pPr>
@@ -10159,9 +10253,9 @@
       </w:tcPr>
     </w:tblStylePr>
   </w:style>
-  <w:style w:type="table" w:styleId="103">
+  <w:style w:type="table" w:styleId="104">
     <w:name w:val="Medium Grid 3 Accent 6"/>
-    <w:basedOn w:val="32"/>
+    <w:basedOn w:val="33"/>
     <w:qFormat/>
     <w:uiPriority w:val="69"/>
     <w:pPr>
@@ -10317,9 +10411,9 @@
       </w:tcPr>
     </w:tblStylePr>
   </w:style>
-  <w:style w:type="table" w:styleId="104">
+  <w:style w:type="table" w:styleId="105">
     <w:name w:val="Dark List"/>
-    <w:basedOn w:val="32"/>
+    <w:basedOn w:val="33"/>
     <w:qFormat/>
     <w:uiPriority w:val="70"/>
     <w:pPr>
@@ -10433,9 +10527,9 @@
       </w:tcPr>
     </w:tblStylePr>
   </w:style>
-  <w:style w:type="table" w:styleId="105">
+  <w:style w:type="table" w:styleId="106">
     <w:name w:val="Dark List Accent 1"/>
-    <w:basedOn w:val="32"/>
+    <w:basedOn w:val="33"/>
     <w:qFormat/>
     <w:uiPriority w:val="70"/>
     <w:pPr>
@@ -10549,9 +10643,9 @@
       </w:tcPr>
     </w:tblStylePr>
   </w:style>
-  <w:style w:type="table" w:styleId="106">
+  <w:style w:type="table" w:styleId="107">
     <w:name w:val="Dark List Accent 2"/>
-    <w:basedOn w:val="32"/>
+    <w:basedOn w:val="33"/>
     <w:qFormat/>
     <w:uiPriority w:val="70"/>
     <w:pPr>
@@ -10665,9 +10759,9 @@
       </w:tcPr>
     </w:tblStylePr>
   </w:style>
-  <w:style w:type="table" w:styleId="107">
+  <w:style w:type="table" w:styleId="108">
     <w:name w:val="Dark List Accent 3"/>
-    <w:basedOn w:val="32"/>
+    <w:basedOn w:val="33"/>
     <w:qFormat/>
     <w:uiPriority w:val="70"/>
     <w:pPr>
@@ -10781,9 +10875,9 @@
       </w:tcPr>
     </w:tblStylePr>
   </w:style>
-  <w:style w:type="table" w:styleId="108">
+  <w:style w:type="table" w:styleId="109">
     <w:name w:val="Dark List Accent 4"/>
-    <w:basedOn w:val="32"/>
+    <w:basedOn w:val="33"/>
     <w:qFormat/>
     <w:uiPriority w:val="70"/>
     <w:pPr>
@@ -10897,9 +10991,9 @@
       </w:tcPr>
     </w:tblStylePr>
   </w:style>
-  <w:style w:type="table" w:styleId="109">
+  <w:style w:type="table" w:styleId="110">
     <w:name w:val="Dark List Accent 5"/>
-    <w:basedOn w:val="32"/>
+    <w:basedOn w:val="33"/>
     <w:qFormat/>
     <w:uiPriority w:val="70"/>
     <w:pPr>
@@ -11013,9 +11107,9 @@
       </w:tcPr>
     </w:tblStylePr>
   </w:style>
-  <w:style w:type="table" w:styleId="110">
+  <w:style w:type="table" w:styleId="111">
     <w:name w:val="Dark List Accent 6"/>
-    <w:basedOn w:val="32"/>
+    <w:basedOn w:val="33"/>
     <w:qFormat/>
     <w:uiPriority w:val="70"/>
     <w:pPr>
@@ -11129,9 +11223,9 @@
       </w:tcPr>
     </w:tblStylePr>
   </w:style>
-  <w:style w:type="table" w:styleId="111">
+  <w:style w:type="table" w:styleId="112">
     <w:name w:val="Colorful Shading"/>
-    <w:basedOn w:val="32"/>
+    <w:basedOn w:val="33"/>
     <w:qFormat/>
     <w:uiPriority w:val="71"/>
     <w:pPr>
@@ -11278,9 +11372,9 @@
       </w:rPr>
     </w:tblStylePr>
   </w:style>
-  <w:style w:type="table" w:styleId="112">
+  <w:style w:type="table" w:styleId="113">
     <w:name w:val="Colorful Shading Accent 1"/>
-    <w:basedOn w:val="32"/>
+    <w:basedOn w:val="33"/>
     <w:qFormat/>
     <w:uiPriority w:val="71"/>
     <w:pPr>
@@ -11427,9 +11521,9 @@
       </w:rPr>
     </w:tblStylePr>
   </w:style>
-  <w:style w:type="table" w:styleId="113">
+  <w:style w:type="table" w:styleId="114">
     <w:name w:val="Colorful Shading Accent 2"/>
-    <w:basedOn w:val="32"/>
+    <w:basedOn w:val="33"/>
     <w:qFormat/>
     <w:uiPriority w:val="71"/>
     <w:pPr>
@@ -11576,9 +11670,9 @@
       </w:rPr>
     </w:tblStylePr>
   </w:style>
-  <w:style w:type="table" w:styleId="114">
+  <w:style w:type="table" w:styleId="115">
     <w:name w:val="Colorful Shading Accent 3"/>
-    <w:basedOn w:val="32"/>
+    <w:basedOn w:val="33"/>
     <w:qFormat/>
     <w:uiPriority w:val="71"/>
     <w:pPr>
@@ -11705,9 +11799,9 @@
       </w:tcPr>
     </w:tblStylePr>
   </w:style>
-  <w:style w:type="table" w:styleId="115">
+  <w:style w:type="table" w:styleId="116">
     <w:name w:val="Colorful Shading Accent 4"/>
-    <w:basedOn w:val="32"/>
+    <w:basedOn w:val="33"/>
     <w:qFormat/>
     <w:uiPriority w:val="71"/>
     <w:pPr>
@@ -11854,9 +11948,9 @@
       </w:rPr>
     </w:tblStylePr>
   </w:style>
-  <w:style w:type="table" w:styleId="116">
+  <w:style w:type="table" w:styleId="117">
     <w:name w:val="Colorful Shading Accent 5"/>
-    <w:basedOn w:val="32"/>
+    <w:basedOn w:val="33"/>
     <w:uiPriority w:val="71"/>
     <w:pPr>
       <w:spacing w:after="0" w:line="240" w:lineRule="auto"/>
@@ -12002,9 +12096,9 @@
       </w:rPr>
     </w:tblStylePr>
   </w:style>
-  <w:style w:type="table" w:styleId="117">
+  <w:style w:type="table" w:styleId="118">
     <w:name w:val="Colorful Shading Accent 6"/>
-    <w:basedOn w:val="32"/>
+    <w:basedOn w:val="33"/>
     <w:uiPriority w:val="71"/>
     <w:pPr>
       <w:spacing w:after="0" w:line="240" w:lineRule="auto"/>
@@ -12150,9 +12244,9 @@
       </w:rPr>
     </w:tblStylePr>
   </w:style>
-  <w:style w:type="table" w:styleId="118">
+  <w:style w:type="table" w:styleId="119">
     <w:name w:val="Colorful List"/>
-    <w:basedOn w:val="32"/>
+    <w:basedOn w:val="33"/>
     <w:uiPriority w:val="72"/>
     <w:pPr>
       <w:spacing w:after="0" w:line="240" w:lineRule="auto"/>
@@ -12242,9 +12336,9 @@
       </w:tcPr>
     </w:tblStylePr>
   </w:style>
-  <w:style w:type="table" w:styleId="119">
+  <w:style w:type="table" w:styleId="120">
     <w:name w:val="Colorful List Accent 1"/>
-    <w:basedOn w:val="32"/>
+    <w:basedOn w:val="33"/>
     <w:uiPriority w:val="72"/>
     <w:pPr>
       <w:spacing w:after="0" w:line="240" w:lineRule="auto"/>
@@ -12334,9 +12428,9 @@
       </w:tcPr>
     </w:tblStylePr>
   </w:style>
-  <w:style w:type="table" w:styleId="120">
+  <w:style w:type="table" w:styleId="121">
     <w:name w:val="Colorful List Accent 2"/>
-    <w:basedOn w:val="32"/>
+    <w:basedOn w:val="33"/>
     <w:uiPriority w:val="72"/>
     <w:pPr>
       <w:spacing w:after="0" w:line="240" w:lineRule="auto"/>
@@ -12426,9 +12520,9 @@
       </w:tcPr>
     </w:tblStylePr>
   </w:style>
-  <w:style w:type="table" w:styleId="121">
+  <w:style w:type="table" w:styleId="122">
     <w:name w:val="Colorful List Accent 3"/>
-    <w:basedOn w:val="32"/>
+    <w:basedOn w:val="33"/>
     <w:uiPriority w:val="72"/>
     <w:pPr>
       <w:spacing w:after="0" w:line="240" w:lineRule="auto"/>
@@ -12518,9 +12612,9 @@
       </w:tcPr>
     </w:tblStylePr>
   </w:style>
-  <w:style w:type="table" w:styleId="122">
+  <w:style w:type="table" w:styleId="123">
     <w:name w:val="Colorful List Accent 4"/>
-    <w:basedOn w:val="32"/>
+    <w:basedOn w:val="33"/>
     <w:uiPriority w:val="72"/>
     <w:pPr>
       <w:spacing w:after="0" w:line="240" w:lineRule="auto"/>
@@ -12610,9 +12704,9 @@
       </w:tcPr>
     </w:tblStylePr>
   </w:style>
-  <w:style w:type="table" w:styleId="123">
+  <w:style w:type="table" w:styleId="124">
     <w:name w:val="Colorful List Accent 5"/>
-    <w:basedOn w:val="32"/>
+    <w:basedOn w:val="33"/>
     <w:uiPriority w:val="72"/>
     <w:pPr>
       <w:spacing w:after="0" w:line="240" w:lineRule="auto"/>
@@ -12702,9 +12796,9 @@
       </w:tcPr>
     </w:tblStylePr>
   </w:style>
-  <w:style w:type="table" w:styleId="124">
+  <w:style w:type="table" w:styleId="125">
     <w:name w:val="Colorful List Accent 6"/>
-    <w:basedOn w:val="32"/>
+    <w:basedOn w:val="33"/>
     <w:uiPriority w:val="72"/>
     <w:pPr>
       <w:spacing w:after="0" w:line="240" w:lineRule="auto"/>
@@ -12794,9 +12888,9 @@
       </w:tcPr>
     </w:tblStylePr>
   </w:style>
-  <w:style w:type="table" w:styleId="125">
+  <w:style w:type="table" w:styleId="126">
     <w:name w:val="Colorful Grid"/>
-    <w:basedOn w:val="32"/>
+    <w:basedOn w:val="33"/>
     <w:uiPriority w:val="73"/>
     <w:pPr>
       <w:spacing w:after="0" w:line="240" w:lineRule="auto"/>
@@ -12890,9 +12984,9 @@
       </w:tcPr>
     </w:tblStylePr>
   </w:style>
-  <w:style w:type="table" w:styleId="126">
+  <w:style w:type="table" w:styleId="127">
     <w:name w:val="Colorful Grid Accent 1"/>
-    <w:basedOn w:val="32"/>
+    <w:basedOn w:val="33"/>
     <w:uiPriority w:val="73"/>
     <w:pPr>
       <w:spacing w:after="0" w:line="240" w:lineRule="auto"/>
@@ -12986,9 +13080,9 @@
       </w:tcPr>
     </w:tblStylePr>
   </w:style>
-  <w:style w:type="table" w:styleId="127">
+  <w:style w:type="table" w:styleId="128">
     <w:name w:val="Colorful Grid Accent 2"/>
-    <w:basedOn w:val="32"/>
+    <w:basedOn w:val="33"/>
     <w:uiPriority w:val="73"/>
     <w:pPr>
       <w:spacing w:after="0" w:line="240" w:lineRule="auto"/>
@@ -13082,9 +13176,9 @@
       </w:tcPr>
     </w:tblStylePr>
   </w:style>
-  <w:style w:type="table" w:styleId="128">
+  <w:style w:type="table" w:styleId="129">
     <w:name w:val="Colorful Grid Accent 3"/>
-    <w:basedOn w:val="32"/>
+    <w:basedOn w:val="33"/>
     <w:uiPriority w:val="73"/>
     <w:pPr>
       <w:spacing w:after="0" w:line="240" w:lineRule="auto"/>
@@ -13178,9 +13272,9 @@
       </w:tcPr>
     </w:tblStylePr>
   </w:style>
-  <w:style w:type="table" w:styleId="129">
+  <w:style w:type="table" w:styleId="130">
     <w:name w:val="Colorful Grid Accent 4"/>
-    <w:basedOn w:val="32"/>
+    <w:basedOn w:val="33"/>
     <w:uiPriority w:val="73"/>
     <w:pPr>
       <w:spacing w:after="0" w:line="240" w:lineRule="auto"/>
@@ -13274,9 +13368,9 @@
       </w:tcPr>
     </w:tblStylePr>
   </w:style>
-  <w:style w:type="table" w:styleId="130">
+  <w:style w:type="table" w:styleId="131">
     <w:name w:val="Colorful Grid Accent 5"/>
-    <w:basedOn w:val="32"/>
+    <w:basedOn w:val="33"/>
     <w:uiPriority w:val="73"/>
     <w:pPr>
       <w:spacing w:after="0" w:line="240" w:lineRule="auto"/>
@@ -13370,9 +13464,9 @@
       </w:tcPr>
     </w:tblStylePr>
   </w:style>
-  <w:style w:type="table" w:styleId="131">
+  <w:style w:type="table" w:styleId="132">
     <w:name w:val="Colorful Grid Accent 6"/>
-    <w:basedOn w:val="32"/>
+    <w:basedOn w:val="33"/>
     <w:uiPriority w:val="73"/>
     <w:pPr>
       <w:spacing w:after="0" w:line="240" w:lineRule="auto"/>
@@ -13466,9 +13560,9 @@
       </w:tcPr>
     </w:tblStylePr>
   </w:style>
-  <w:style w:type="character" w:styleId="133">
+  <w:style w:type="character" w:styleId="134">
     <w:name w:val="Strong"/>
-    <w:basedOn w:val="132"/>
+    <w:basedOn w:val="133"/>
     <w:qFormat/>
     <w:uiPriority w:val="22"/>
     <w:rPr>
@@ -13476,9 +13570,9 @@
       <w:bCs/>
     </w:rPr>
   </w:style>
-  <w:style w:type="character" w:styleId="134">
+  <w:style w:type="character" w:styleId="135">
     <w:name w:val="Emphasis"/>
-    <w:basedOn w:val="132"/>
+    <w:basedOn w:val="133"/>
     <w:qFormat/>
     <w:uiPriority w:val="20"/>
     <w:rPr>
@@ -13486,20 +13580,20 @@
       <w:iCs/>
     </w:rPr>
   </w:style>
-  <w:style w:type="character" w:customStyle="1" w:styleId="135">
+  <w:style w:type="character" w:customStyle="1" w:styleId="136">
     <w:name w:val="Header Char"/>
-    <w:basedOn w:val="132"/>
+    <w:basedOn w:val="133"/>
     <w:link w:val="25"/>
     <w:uiPriority w:val="99"/>
   </w:style>
-  <w:style w:type="character" w:customStyle="1" w:styleId="136">
+  <w:style w:type="character" w:customStyle="1" w:styleId="137">
     <w:name w:val="Footer Char"/>
-    <w:basedOn w:val="132"/>
+    <w:basedOn w:val="133"/>
     <w:link w:val="24"/>
     <w:qFormat/>
     <w:uiPriority w:val="99"/>
   </w:style>
-  <w:style w:type="paragraph" w:styleId="137">
+  <w:style w:type="paragraph" w:styleId="138">
     <w:name w:val="No Spacing"/>
     <w:qFormat/>
     <w:uiPriority w:val="1"/>
@@ -13513,9 +13607,9 @@
       <w:lang w:val="en-US" w:eastAsia="en-US" w:bidi="ar-SA"/>
     </w:rPr>
   </w:style>
-  <w:style w:type="character" w:customStyle="1" w:styleId="138">
+  <w:style w:type="character" w:customStyle="1" w:styleId="139">
     <w:name w:val="Heading 1 Char"/>
-    <w:basedOn w:val="132"/>
+    <w:basedOn w:val="133"/>
     <w:link w:val="3"/>
     <w:qFormat/>
     <w:uiPriority w:val="9"/>
@@ -13528,9 +13622,9 @@
       <w:szCs w:val="28"/>
     </w:rPr>
   </w:style>
-  <w:style w:type="character" w:customStyle="1" w:styleId="139">
+  <w:style w:type="character" w:customStyle="1" w:styleId="140">
     <w:name w:val="Heading 2 Char"/>
-    <w:basedOn w:val="132"/>
+    <w:basedOn w:val="133"/>
     <w:link w:val="4"/>
     <w:qFormat/>
     <w:uiPriority w:val="9"/>
@@ -13548,9 +13642,9 @@
       </w14:textFill>
     </w:rPr>
   </w:style>
-  <w:style w:type="character" w:customStyle="1" w:styleId="140">
+  <w:style w:type="character" w:customStyle="1" w:styleId="141">
     <w:name w:val="Heading 3 Char"/>
-    <w:basedOn w:val="132"/>
+    <w:basedOn w:val="133"/>
     <w:link w:val="5"/>
     <w:qFormat/>
     <w:uiPriority w:val="9"/>
@@ -13566,10 +13660,10 @@
       </w14:textFill>
     </w:rPr>
   </w:style>
-  <w:style w:type="character" w:customStyle="1" w:styleId="141">
+  <w:style w:type="character" w:customStyle="1" w:styleId="142">
     <w:name w:val="Title Char"/>
-    <w:basedOn w:val="132"/>
-    <w:link w:val="31"/>
+    <w:basedOn w:val="133"/>
+    <w:link w:val="32"/>
     <w:qFormat/>
     <w:uiPriority w:val="10"/>
     <w:rPr>
@@ -13581,9 +13675,9 @@
       <w:szCs w:val="52"/>
     </w:rPr>
   </w:style>
-  <w:style w:type="character" w:customStyle="1" w:styleId="142">
+  <w:style w:type="character" w:customStyle="1" w:styleId="143">
     <w:name w:val="Subtitle Char"/>
-    <w:basedOn w:val="132"/>
+    <w:basedOn w:val="133"/>
     <w:link w:val="26"/>
     <w:qFormat/>
     <w:uiPriority w:val="11"/>
@@ -13602,7 +13696,7 @@
       </w14:textFill>
     </w:rPr>
   </w:style>
-  <w:style w:type="paragraph" w:styleId="143">
+  <w:style w:type="paragraph" w:styleId="144">
     <w:name w:val="List Paragraph"/>
     <w:basedOn w:val="1"/>
     <w:qFormat/>
@@ -13612,22 +13706,22 @@
       <w:contextualSpacing/>
     </w:pPr>
   </w:style>
-  <w:style w:type="character" w:customStyle="1" w:styleId="144">
+  <w:style w:type="character" w:customStyle="1" w:styleId="145">
     <w:name w:val="Body Text Char"/>
-    <w:basedOn w:val="132"/>
+    <w:basedOn w:val="133"/>
     <w:link w:val="19"/>
     <w:uiPriority w:val="99"/>
   </w:style>
-  <w:style w:type="character" w:customStyle="1" w:styleId="145">
+  <w:style w:type="character" w:customStyle="1" w:styleId="146">
     <w:name w:val="Body Text 2 Char"/>
-    <w:basedOn w:val="132"/>
+    <w:basedOn w:val="133"/>
     <w:link w:val="28"/>
     <w:qFormat/>
     <w:uiPriority w:val="99"/>
   </w:style>
-  <w:style w:type="character" w:customStyle="1" w:styleId="146">
+  <w:style w:type="character" w:customStyle="1" w:styleId="147">
     <w:name w:val="Body Text 3 Char"/>
-    <w:basedOn w:val="132"/>
+    <w:basedOn w:val="133"/>
     <w:link w:val="17"/>
     <w:uiPriority w:val="99"/>
     <w:rPr>
@@ -13635,9 +13729,9 @@
       <w:szCs w:val="16"/>
     </w:rPr>
   </w:style>
-  <w:style w:type="character" w:customStyle="1" w:styleId="147">
+  <w:style w:type="character" w:customStyle="1" w:styleId="148">
     <w:name w:val="Macro Text Char"/>
-    <w:basedOn w:val="132"/>
+    <w:basedOn w:val="133"/>
     <w:link w:val="2"/>
     <w:qFormat/>
     <w:uiPriority w:val="99"/>
@@ -13647,11 +13741,11 @@
       <w:szCs w:val="20"/>
     </w:rPr>
   </w:style>
-  <w:style w:type="paragraph" w:styleId="148">
+  <w:style w:type="paragraph" w:styleId="149">
     <w:name w:val="Quote"/>
     <w:basedOn w:val="1"/>
     <w:next w:val="1"/>
-    <w:link w:val="149"/>
+    <w:link w:val="150"/>
     <w:qFormat/>
     <w:uiPriority w:val="29"/>
     <w:rPr>
@@ -13665,10 +13759,10 @@
       </w14:textFill>
     </w:rPr>
   </w:style>
-  <w:style w:type="character" w:customStyle="1" w:styleId="149">
+  <w:style w:type="character" w:customStyle="1" w:styleId="150">
     <w:name w:val="Quote Char"/>
-    <w:basedOn w:val="132"/>
-    <w:link w:val="148"/>
+    <w:basedOn w:val="133"/>
+    <w:link w:val="149"/>
     <w:uiPriority w:val="29"/>
     <w:rPr>
       <w:i/>
@@ -13681,9 +13775,9 @@
       </w14:textFill>
     </w:rPr>
   </w:style>
-  <w:style w:type="character" w:customStyle="1" w:styleId="150">
+  <w:style w:type="character" w:customStyle="1" w:styleId="151">
     <w:name w:val="Heading 4 Char"/>
-    <w:basedOn w:val="132"/>
+    <w:basedOn w:val="133"/>
     <w:link w:val="6"/>
     <w:semiHidden/>
     <w:uiPriority w:val="9"/>
@@ -13701,9 +13795,9 @@
       </w14:textFill>
     </w:rPr>
   </w:style>
-  <w:style w:type="character" w:customStyle="1" w:styleId="151">
+  <w:style w:type="character" w:customStyle="1" w:styleId="152">
     <w:name w:val="Heading 5 Char"/>
-    <w:basedOn w:val="132"/>
+    <w:basedOn w:val="133"/>
     <w:link w:val="7"/>
     <w:semiHidden/>
     <w:qFormat/>
@@ -13713,9 +13807,9 @@
       <w:color w:val="254061" w:themeColor="accent1" w:themeShade="80"/>
     </w:rPr>
   </w:style>
-  <w:style w:type="character" w:customStyle="1" w:styleId="152">
+  <w:style w:type="character" w:customStyle="1" w:styleId="153">
     <w:name w:val="Heading 6 Char"/>
-    <w:basedOn w:val="132"/>
+    <w:basedOn w:val="133"/>
     <w:link w:val="8"/>
     <w:semiHidden/>
     <w:uiPriority w:val="9"/>
@@ -13726,9 +13820,9 @@
       <w:color w:val="254061" w:themeColor="accent1" w:themeShade="80"/>
     </w:rPr>
   </w:style>
-  <w:style w:type="character" w:customStyle="1" w:styleId="153">
+  <w:style w:type="character" w:customStyle="1" w:styleId="154">
     <w:name w:val="Heading 7 Char"/>
-    <w:basedOn w:val="132"/>
+    <w:basedOn w:val="133"/>
     <w:link w:val="9"/>
     <w:semiHidden/>
     <w:uiPriority w:val="9"/>
@@ -13747,9 +13841,9 @@
       </w14:textFill>
     </w:rPr>
   </w:style>
-  <w:style w:type="character" w:customStyle="1" w:styleId="154">
+  <w:style w:type="character" w:customStyle="1" w:styleId="155">
     <w:name w:val="Heading 8 Char"/>
-    <w:basedOn w:val="132"/>
+    <w:basedOn w:val="133"/>
     <w:link w:val="10"/>
     <w:semiHidden/>
     <w:qFormat/>
@@ -13766,9 +13860,9 @@
       </w14:textFill>
     </w:rPr>
   </w:style>
-  <w:style w:type="character" w:customStyle="1" w:styleId="155">
+  <w:style w:type="character" w:customStyle="1" w:styleId="156">
     <w:name w:val="Heading 9 Char"/>
-    <w:basedOn w:val="132"/>
+    <w:basedOn w:val="133"/>
     <w:link w:val="11"/>
     <w:semiHidden/>
     <w:uiPriority w:val="9"/>
@@ -13789,11 +13883,11 @@
       </w14:textFill>
     </w:rPr>
   </w:style>
-  <w:style w:type="paragraph" w:styleId="156">
+  <w:style w:type="paragraph" w:styleId="157">
     <w:name w:val="Intense Quote"/>
     <w:basedOn w:val="1"/>
     <w:next w:val="1"/>
-    <w:link w:val="157"/>
+    <w:link w:val="158"/>
     <w:qFormat/>
     <w:uiPriority w:val="30"/>
     <w:pPr>
@@ -13816,10 +13910,10 @@
       </w14:textFill>
     </w:rPr>
   </w:style>
-  <w:style w:type="character" w:customStyle="1" w:styleId="157">
+  <w:style w:type="character" w:customStyle="1" w:styleId="158">
     <w:name w:val="Intense Quote Char"/>
-    <w:basedOn w:val="132"/>
-    <w:link w:val="156"/>
+    <w:basedOn w:val="133"/>
+    <w:link w:val="157"/>
     <w:uiPriority w:val="30"/>
     <w:rPr>
       <w:b/>
@@ -13834,9 +13928,9 @@
       </w14:textFill>
     </w:rPr>
   </w:style>
-  <w:style w:type="character" w:customStyle="1" w:styleId="158">
+  <w:style w:type="character" w:customStyle="1" w:styleId="159">
     <w:name w:val="Subtle Emphasis"/>
-    <w:basedOn w:val="132"/>
+    <w:basedOn w:val="133"/>
     <w:qFormat/>
     <w:uiPriority w:val="19"/>
     <w:rPr>
@@ -13853,9 +13947,9 @@
       </w14:textFill>
     </w:rPr>
   </w:style>
-  <w:style w:type="character" w:customStyle="1" w:styleId="159">
+  <w:style w:type="character" w:customStyle="1" w:styleId="160">
     <w:name w:val="Intense Emphasis"/>
-    <w:basedOn w:val="132"/>
+    <w:basedOn w:val="133"/>
     <w:qFormat/>
     <w:uiPriority w:val="21"/>
     <w:rPr>
@@ -13871,9 +13965,9 @@
       </w14:textFill>
     </w:rPr>
   </w:style>
-  <w:style w:type="character" w:customStyle="1" w:styleId="160">
+  <w:style w:type="character" w:customStyle="1" w:styleId="161">
     <w:name w:val="Subtle Reference"/>
-    <w:basedOn w:val="132"/>
+    <w:basedOn w:val="133"/>
     <w:qFormat/>
     <w:uiPriority w:val="31"/>
     <w:rPr>
@@ -13887,9 +13981,9 @@
       </w14:textFill>
     </w:rPr>
   </w:style>
-  <w:style w:type="character" w:customStyle="1" w:styleId="161">
+  <w:style w:type="character" w:customStyle="1" w:styleId="162">
     <w:name w:val="Intense Reference"/>
-    <w:basedOn w:val="132"/>
+    <w:basedOn w:val="133"/>
     <w:qFormat/>
     <w:uiPriority w:val="32"/>
     <w:rPr>
@@ -13906,9 +14000,9 @@
       </w14:textFill>
     </w:rPr>
   </w:style>
-  <w:style w:type="character" w:customStyle="1" w:styleId="162">
+  <w:style w:type="character" w:customStyle="1" w:styleId="163">
     <w:name w:val="Book Title"/>
-    <w:basedOn w:val="132"/>
+    <w:basedOn w:val="133"/>
     <w:qFormat/>
     <w:uiPriority w:val="33"/>
     <w:rPr>
@@ -13918,7 +14012,7 @@
       <w:spacing w:val="5"/>
     </w:rPr>
   </w:style>
-  <w:style w:type="paragraph" w:customStyle="1" w:styleId="163">
+  <w:style w:type="paragraph" w:customStyle="1" w:styleId="164">
     <w:name w:val="TOC Heading"/>
     <w:basedOn w:val="3"/>
     <w:next w:val="1"/>

</xml_diff>

<commit_message>
resume: FTP upload, BAGCheck first in full-stack variant
</commit_message>
<xml_diff>
--- a/resume/resume-ai-fullstack.docx
+++ b/resume/resume-ai-fullstack.docx
@@ -392,189 +392,6 @@
       </w:pPr>
       <w:r>
         <w:rPr>
-          <w:b/>
-        </w:rPr>
-        <w:t>烟标质检助手 · HarmonyOS 端侧质检 App（课题组校企合作 · 已通过真机验收）</w:t>
-      </w:r>
-      <w:r>
-        <w:tab/>
-      </w:r>
-      <w:r>
-        <w:t>2026.06 — 至今</w:t>
-      </w:r>
-    </w:p>
-    <w:p>
-      <w:pPr>
-        <w:pStyle w:val="30"/>
-        <w:keepNext w:val="0"/>
-        <w:keepLines w:val="0"/>
-        <w:widowControl/>
-        <w:suppressLineNumbers w:val="0"/>
-        <w:shd w:val="clear" w:fill="FFFFFF"/>
-        <w:spacing w:before="160" w:beforeAutospacing="0" w:after="160" w:afterAutospacing="0"/>
-        <w:ind w:left="0" w:right="0" w:firstLine="0"/>
-        <w:rPr>
-          <w:rFonts w:ascii="Segoe UI" w:hAnsi="Segoe UI" w:eastAsia="Segoe UI" w:cs="Segoe UI"/>
-          <w:i w:val="0"/>
-          <w:iCs w:val="0"/>
-          <w:caps w:val="0"/>
-          <w:color w:val="0F1115"/>
-          <w:spacing w:val="0"/>
-          <w:sz w:val="21"/>
-          <w:szCs w:val="21"/>
-        </w:rPr>
-      </w:pPr>
-      <w:r>
-        <w:rPr>
-          <w:rFonts w:hint="default" w:ascii="Segoe UI" w:hAnsi="Segoe UI" w:eastAsia="Segoe UI" w:cs="Segoe UI"/>
-          <w:i w:val="0"/>
-          <w:iCs w:val="0"/>
-          <w:caps w:val="0"/>
-          <w:color w:val="0F1115"/>
-          <w:spacing w:val="0"/>
-          <w:sz w:val="21"/>
-          <w:szCs w:val="21"/>
-          <w:shd w:val="clear" w:fill="FFFFFF"/>
-        </w:rPr>
-        <w:t>把 烟标缺陷检测搬到 HarmonyOS 手机：YOLOv8 在端侧推理出结论，检测记录与原图上传服务器做集中复核与统计，形成「拍摄 → 检测 → 判定 → 上传 → 复核」闭环。本人负责端侧架构、模型接入、可靠上传与本地数据层。</w:t>
-      </w:r>
-    </w:p>
-    <w:p>
-      <w:pPr>
-        <w:pStyle w:val="30"/>
-        <w:keepNext w:val="0"/>
-        <w:keepLines w:val="0"/>
-        <w:widowControl/>
-        <w:suppressLineNumbers w:val="0"/>
-        <w:shd w:val="clear" w:fill="FFFFFF"/>
-        <w:spacing w:before="160" w:beforeAutospacing="0" w:after="160" w:afterAutospacing="0"/>
-        <w:ind w:left="0" w:right="0" w:firstLine="0"/>
-        <w:rPr>
-          <w:rFonts w:hint="default" w:ascii="Segoe UI" w:hAnsi="Segoe UI" w:eastAsia="Segoe UI" w:cs="Segoe UI"/>
-          <w:i w:val="0"/>
-          <w:iCs w:val="0"/>
-          <w:caps w:val="0"/>
-          <w:color w:val="0F1115"/>
-          <w:spacing w:val="0"/>
-          <w:sz w:val="21"/>
-          <w:szCs w:val="21"/>
-        </w:rPr>
-      </w:pPr>
-      <w:r>
-        <w:rPr>
-          <w:rFonts w:hint="default" w:ascii="Segoe UI" w:hAnsi="Segoe UI" w:eastAsia="Segoe UI" w:cs="Segoe UI"/>
-          <w:i w:val="0"/>
-          <w:iCs w:val="0"/>
-          <w:caps w:val="0"/>
-          <w:color w:val="0F1115"/>
-          <w:spacing w:val="0"/>
-          <w:sz w:val="21"/>
-          <w:szCs w:val="21"/>
-          <w:shd w:val="clear" w:fill="FFFFFF"/>
-        </w:rPr>
-        <w:t>技术栈：ArkTS / ArkUI、YOLOv8、模型导出与端侧推理、C++ / NAPI、OpenCV、HarmonyOS RDB、HTTP 上传与重试、TaskPool、HAP 签名打包</w:t>
-      </w:r>
-    </w:p>
-    <w:p>
-      <w:pPr>
-        <w:spacing w:before="0" w:after="40" w:line="276" w:lineRule="auto"/>
-        <w:ind w:left="320" w:hanging="320"/>
-        <w:rPr>
-          <w:rFonts w:hint="default"/>
-        </w:rPr>
-      </w:pPr>
-      <w:r>
-        <w:rPr>
-          <w:rFonts w:hint="default"/>
-        </w:rPr>
-        <w:t>• 端侧 AI 链路：拍摄取图 → 预处理 → YOLOv8 推理 → 置信度过滤 → 本地落库 → 上传。模型与业务解耦，检测器可整体替换（早期传统 CV 链路切到 YOLOv8），换模型不动界面、数据与上传逻辑</w:t>
-      </w:r>
-    </w:p>
-    <w:p>
-      <w:pPr>
-        <w:spacing w:before="0" w:after="40" w:line="276" w:lineRule="auto"/>
-        <w:ind w:left="320" w:hanging="320"/>
-        <w:rPr>
-          <w:rFonts w:hint="default"/>
-        </w:rPr>
-      </w:pPr>
-      <w:r>
-        <w:rPr>
-          <w:rFonts w:hint="default"/>
-        </w:rPr>
-        <w:t>• 上传可靠性：检测记录带唯一 ID 与状态机（待上传 / 已上传 / 失败），失败按退避重试、重复上传按 ID 幂等去重；原图与记录分开传，先小后大，弱网下优先保住判定结论</w:t>
-      </w:r>
-    </w:p>
-    <w:p>
-      <w:pPr>
-        <w:spacing w:before="0" w:after="40" w:line="276" w:lineRule="auto"/>
-        <w:ind w:left="320" w:hanging="320"/>
-        <w:rPr>
-          <w:rFonts w:hint="eastAsia" w:eastAsia="宋体"/>
-          <w:lang w:eastAsia="zh-CN"/>
-        </w:rPr>
-      </w:pPr>
-      <w:r>
-        <w:rPr>
-          <w:rFonts w:hint="default"/>
-        </w:rPr>
-        <w:t>• </w:t>
-      </w:r>
-      <w:r>
-        <w:rPr>
-          <w:rFonts w:hint="eastAsia"/>
-          <w:lang w:eastAsia="zh-CN"/>
-        </w:rPr>
-        <w:t>模型置信度分流策略：高置信度结果直接输出判定结论，低置信度结果标记“建议人工复核”，复核结果回流样本库，用于补充训练数据与下一轮模型迭代。</w:t>
-      </w:r>
-    </w:p>
-    <w:p>
-      <w:pPr>
-        <w:spacing w:before="0" w:after="40" w:line="276" w:lineRule="auto"/>
-        <w:ind w:left="320" w:hanging="320"/>
-        <w:rPr>
-          <w:rFonts w:hint="default"/>
-        </w:rPr>
-      </w:pPr>
-      <w:r>
-        <w:rPr>
-          <w:rFonts w:hint="default"/>
-        </w:rPr>
-        <w:t>• 数据层（RDB）：样本库、检测历史、上传状态与登录态持久化到 HarmonyOS 关系型数据库，支持按时间 / 结果 / 置信度 / 上传状态检索；原图与记录绑定，可复现任意一张烟标的判定过程</w:t>
-      </w:r>
-    </w:p>
-    <w:p>
-      <w:pPr>
-        <w:spacing w:before="0" w:after="40" w:line="276" w:lineRule="auto"/>
-        <w:ind w:left="320" w:hanging="320"/>
-        <w:rPr>
-          <w:rFonts w:hint="eastAsia" w:eastAsia="宋体"/>
-          <w:lang w:eastAsia="zh-CN"/>
-        </w:rPr>
-      </w:pPr>
-      <w:r>
-        <w:rPr>
-          <w:rFonts w:hint="default"/>
-        </w:rPr>
-        <w:t>• 交付与验证：按「数据与标注 → 模型训练导出 → NAPI 打通 → 真机一致性验收」四阶段推进；覆盖文字行、图标、烫金套印与脏点四类缺陷</w:t>
-      </w:r>
-      <w:r>
-        <w:rPr>
-          <w:rFonts w:hint="eastAsia" w:eastAsia="宋体"/>
-          <w:lang w:eastAsia="zh-CN"/>
-        </w:rPr>
-        <w:t>。</w:t>
-      </w:r>
-      <w:bookmarkStart w:id="0" w:name="_GoBack"/>
-      <w:bookmarkEnd w:id="0"/>
-    </w:p>
-    <w:p>
-      <w:pPr>
-        <w:keepNext/>
-        <w:spacing w:before="120" w:after="40" w:line="276" w:lineRule="auto"/>
-      </w:pPr>
-      <w:r>
-        <w:rPr>
           <w:rFonts w:ascii="微软雅黑" w:hAnsi="微软雅黑" w:eastAsia="微软雅黑"/>
           <w:b/>
           <w:color w:val="19232D"/>
@@ -724,6 +541,189 @@
         </w:rPr>
         <w:t>•双路算法与融合：可见光侧采用DP跟踪求解最优边缘，结合确定性RANSAC拟合基准线（设置内点率、覆盖率、残差、倾角四重质量门）；红外侧实现自适应温度分割、逐列几何量测、基于MAD的稳健异物检测；双相机通过PLC硬触发同帧采集，纳秒级时间戳配对误差±100ms，任一路数据缺失即降级为UNKNOWN状态，而非直接放行。</w:t>
       </w:r>
+    </w:p>
+    <w:p>
+      <w:pPr>
+        <w:keepNext/>
+        <w:spacing w:before="120" w:after="40" w:line="276" w:lineRule="auto"/>
+      </w:pPr>
+      <w:r>
+        <w:rPr>
+          <w:b/>
+        </w:rPr>
+        <w:t>烟标质检助手 · HarmonyOS 端侧质检 App（课题组校企合作 · 已通过真机验收）</w:t>
+      </w:r>
+      <w:r>
+        <w:tab/>
+      </w:r>
+      <w:r>
+        <w:t>2026.06 — 至今</w:t>
+      </w:r>
+    </w:p>
+    <w:p>
+      <w:pPr>
+        <w:pStyle w:val="30"/>
+        <w:keepNext w:val="0"/>
+        <w:keepLines w:val="0"/>
+        <w:widowControl/>
+        <w:suppressLineNumbers w:val="0"/>
+        <w:shd w:val="clear" w:fill="FFFFFF"/>
+        <w:spacing w:before="160" w:beforeAutospacing="0" w:after="160" w:afterAutospacing="0"/>
+        <w:ind w:left="0" w:right="0" w:firstLine="0"/>
+        <w:rPr>
+          <w:rFonts w:ascii="Segoe UI" w:hAnsi="Segoe UI" w:eastAsia="Segoe UI" w:cs="Segoe UI"/>
+          <w:i w:val="0"/>
+          <w:iCs w:val="0"/>
+          <w:caps w:val="0"/>
+          <w:color w:val="0F1115"/>
+          <w:spacing w:val="0"/>
+          <w:sz w:val="21"/>
+          <w:szCs w:val="21"/>
+        </w:rPr>
+      </w:pPr>
+      <w:r>
+        <w:rPr>
+          <w:rFonts w:hint="default" w:ascii="Segoe UI" w:hAnsi="Segoe UI" w:eastAsia="Segoe UI" w:cs="Segoe UI"/>
+          <w:i w:val="0"/>
+          <w:iCs w:val="0"/>
+          <w:caps w:val="0"/>
+          <w:color w:val="0F1115"/>
+          <w:spacing w:val="0"/>
+          <w:sz w:val="21"/>
+          <w:szCs w:val="21"/>
+          <w:shd w:val="clear" w:fill="FFFFFF"/>
+        </w:rPr>
+        <w:t>把 烟标缺陷检测搬到 HarmonyOS 手机：YOLOv8 在端侧推理出结论，检测记录与原图上传服务器做集中复核与统计，形成「拍摄 → 检测 → 判定 → 上传 → 复核」闭环。本人负责端侧架构、模型接入、可靠上传与本地数据层。</w:t>
+      </w:r>
+    </w:p>
+    <w:p>
+      <w:pPr>
+        <w:pStyle w:val="30"/>
+        <w:keepNext w:val="0"/>
+        <w:keepLines w:val="0"/>
+        <w:widowControl/>
+        <w:suppressLineNumbers w:val="0"/>
+        <w:shd w:val="clear" w:fill="FFFFFF"/>
+        <w:spacing w:before="160" w:beforeAutospacing="0" w:after="160" w:afterAutospacing="0"/>
+        <w:ind w:left="0" w:right="0" w:firstLine="0"/>
+        <w:rPr>
+          <w:rFonts w:hint="default" w:ascii="Segoe UI" w:hAnsi="Segoe UI" w:eastAsia="Segoe UI" w:cs="Segoe UI"/>
+          <w:i w:val="0"/>
+          <w:iCs w:val="0"/>
+          <w:caps w:val="0"/>
+          <w:color w:val="0F1115"/>
+          <w:spacing w:val="0"/>
+          <w:sz w:val="21"/>
+          <w:szCs w:val="21"/>
+        </w:rPr>
+      </w:pPr>
+      <w:r>
+        <w:rPr>
+          <w:rFonts w:hint="default" w:ascii="Segoe UI" w:hAnsi="Segoe UI" w:eastAsia="Segoe UI" w:cs="Segoe UI"/>
+          <w:i w:val="0"/>
+          <w:iCs w:val="0"/>
+          <w:caps w:val="0"/>
+          <w:color w:val="0F1115"/>
+          <w:spacing w:val="0"/>
+          <w:sz w:val="21"/>
+          <w:szCs w:val="21"/>
+          <w:shd w:val="clear" w:fill="FFFFFF"/>
+        </w:rPr>
+        <w:t>技术栈：ArkTS / ArkUI、YOLOv8、模型导出与端侧推理、C++ / NAPI、OpenCV、HarmonyOS RDB、FTP 上传、TaskPool、HAP 签名打包</w:t>
+      </w:r>
+    </w:p>
+    <w:p>
+      <w:pPr>
+        <w:spacing w:before="0" w:after="40" w:line="276" w:lineRule="auto"/>
+        <w:ind w:left="320" w:hanging="320"/>
+        <w:rPr>
+          <w:rFonts w:hint="default"/>
+        </w:rPr>
+      </w:pPr>
+      <w:r>
+        <w:rPr>
+          <w:rFonts w:hint="default"/>
+        </w:rPr>
+        <w:t>• 端侧 AI 链路：拍摄取图 → 预处理 → YOLOv8 推理 → 置信度过滤 → 本地落库 → 上传。模型与业务解耦，检测器可整体替换（早期传统 CV 链路切到 YOLOv8），换模型不动界面、数据与上传逻辑</w:t>
+      </w:r>
+    </w:p>
+    <w:p>
+      <w:pPr>
+        <w:spacing w:before="0" w:after="40" w:line="276" w:lineRule="auto"/>
+        <w:ind w:left="320" w:hanging="320"/>
+        <w:rPr>
+          <w:rFonts w:hint="default"/>
+        </w:rPr>
+      </w:pPr>
+      <w:r>
+        <w:rPr>
+          <w:rFonts w:hint="default"/>
+        </w:rPr>
+        <w:t>• 上传可靠性：检测记录带唯一 ID 与状态机（待上传 / 已上传 / 失败），失败按退避重试、重复上传按 ID 幂等去重；原图与记录分开传，先小后大，弱网下优先保住判定结论</w:t>
+      </w:r>
+    </w:p>
+    <w:p>
+      <w:pPr>
+        <w:spacing w:before="0" w:after="40" w:line="276" w:lineRule="auto"/>
+        <w:ind w:left="320" w:hanging="320"/>
+        <w:rPr>
+          <w:rFonts w:hint="eastAsia" w:eastAsia="宋体"/>
+          <w:lang w:eastAsia="zh-CN"/>
+        </w:rPr>
+      </w:pPr>
+      <w:r>
+        <w:rPr>
+          <w:rFonts w:hint="default"/>
+        </w:rPr>
+        <w:t>• </w:t>
+      </w:r>
+      <w:r>
+        <w:rPr>
+          <w:rFonts w:hint="eastAsia"/>
+          <w:lang w:eastAsia="zh-CN"/>
+        </w:rPr>
+        <w:t>模型置信度分流策略：高置信度结果直接输出判定结论，低置信度结果标记“建议人工复核”，复核结果回流样本库，用于补充训练数据与下一轮模型迭代。</w:t>
+      </w:r>
+    </w:p>
+    <w:p>
+      <w:pPr>
+        <w:spacing w:before="0" w:after="40" w:line="276" w:lineRule="auto"/>
+        <w:ind w:left="320" w:hanging="320"/>
+        <w:rPr>
+          <w:rFonts w:hint="default"/>
+        </w:rPr>
+      </w:pPr>
+      <w:r>
+        <w:rPr>
+          <w:rFonts w:hint="default"/>
+        </w:rPr>
+        <w:t>• 数据层（RDB）：样本库、检测历史、上传状态与登录态持久化到 HarmonyOS 关系型数据库，支持按时间 / 结果 / 置信度 / 上传状态检索；原图与记录绑定，可复现任意一张烟标的判定过程</w:t>
+      </w:r>
+    </w:p>
+    <w:p>
+      <w:pPr>
+        <w:spacing w:before="0" w:after="40" w:line="276" w:lineRule="auto"/>
+        <w:ind w:left="320" w:hanging="320"/>
+        <w:rPr>
+          <w:rFonts w:hint="eastAsia" w:eastAsia="宋体"/>
+          <w:lang w:eastAsia="zh-CN"/>
+        </w:rPr>
+      </w:pPr>
+      <w:r>
+        <w:rPr>
+          <w:rFonts w:hint="default"/>
+        </w:rPr>
+        <w:t>• 交付与验证：按「数据与标注 → 模型训练导出 → NAPI 打通 → 真机一致性验收」四阶段推进；覆盖文字行、图标、烫金套印与脏点四类缺陷</w:t>
+      </w:r>
+      <w:r>
+        <w:rPr>
+          <w:rFonts w:hint="eastAsia" w:eastAsia="宋体"/>
+          <w:lang w:eastAsia="zh-CN"/>
+        </w:rPr>
+        <w:t>。</w:t>
+      </w:r>
+      <w:bookmarkStart w:id="0" w:name="_GoBack"/>
+      <w:bookmarkEnd w:id="0"/>
     </w:p>
     <w:p>
       <w:pPr>

</xml_diff>